<commit_message>
Backend updates: fix score<0 bug, site_reg rename, gender mapping, bracket columns, PizZip zip fix, ME templates
</commit_message>
<xml_diff>
--- a/public/templates/MBCDI report ME 16-30mo_AT RISK.docx
+++ b/public/templates/MBCDI report ME 16-30mo_AT RISK.docx
@@ -61,7 +61,7 @@
           <w:sz w:val="22"/>
           <w:szCs w:val="22"/>
         </w:rPr>
-        <w:t>[ ]</w:t>
+        <w:t>Play With Me</w:t>
       </w:r>
       <w:r>
         <w:rPr>
@@ -1936,15 +1936,1798 @@
       </w:pPr>
     </w:p>
     <w:p>
+      <w:r>
+        <w:br w:type="page"/>
+      </w:r>
+    </w:p>
+    <w:p>
+      <w:pPr>
+        <w:rPr>
+          <w:rFonts w:ascii="KaiTi" w:eastAsia="KaiTi" w:hAnsi="KaiTi" w:cs="Times New Roman"/>
+          <w:sz w:val="22"/>
+          <w:szCs w:val="22"/>
+        </w:rPr>
+      </w:pPr>
+      <w:r>
+        <w:rPr>
+          <w:rFonts w:ascii="KaiTi" w:eastAsia="KaiTi" w:hAnsi="KaiTi" w:cs="Times New Roman" w:hint="eastAsia"/>
+          <w:sz w:val="22"/>
+          <w:szCs w:val="22"/>
+        </w:rPr>
+        <w:lastRenderedPageBreak/>
+        <w:t>亲爱的家长您好，</w:t>
+      </w:r>
+      <w:r>
+        <w:rPr>
+          <w:rFonts w:ascii="Calibri" w:eastAsia="KaiTi" w:hAnsi="Calibri" w:cs="Calibri"/>
+          <w:sz w:val="22"/>
+          <w:szCs w:val="22"/>
+        </w:rPr>
+        <w:t> </w:t>
+      </w:r>
+    </w:p>
+    <w:p>
+      <w:pPr>
+        <w:rPr>
+          <w:rFonts w:ascii="KaiTi" w:eastAsia="KaiTi" w:hAnsi="KaiTi" w:cs="Times New Roman"/>
+          <w:sz w:val="22"/>
+          <w:szCs w:val="22"/>
+        </w:rPr>
+      </w:pPr>
+      <w:r>
+        <w:rPr>
+          <w:rFonts w:ascii="Calibri" w:eastAsia="KaiTi" w:hAnsi="Calibri" w:cs="Calibri"/>
+          <w:sz w:val="22"/>
+          <w:szCs w:val="22"/>
+        </w:rPr>
+        <w:t> </w:t>
+      </w:r>
+    </w:p>
+    <w:p>
+      <w:pPr>
+        <w:rPr>
+          <w:rFonts w:ascii="KaiTi" w:eastAsia="KaiTi" w:hAnsi="KaiTi" w:cs="Times New Roman"/>
+          <w:sz w:val="22"/>
+          <w:szCs w:val="22"/>
+        </w:rPr>
+      </w:pPr>
+      <w:r>
+        <w:rPr>
+          <w:rFonts w:ascii="KaiTi" w:eastAsia="KaiTi" w:hAnsi="KaiTi" w:cs="Times New Roman" w:hint="eastAsia"/>
+          <w:sz w:val="22"/>
+          <w:szCs w:val="22"/>
+        </w:rPr>
+        <w:t>非常感谢您和您的孩子参与德州大学达拉斯分校的</w:t>
+      </w:r>
+      <w:r>
+        <w:rPr>
+          <w:rFonts w:ascii="KaiTi" w:eastAsia="KaiTi" w:hAnsi="KaiTi" w:cs="Times New Roman"/>
+          <w:sz w:val="22"/>
+          <w:szCs w:val="22"/>
+        </w:rPr>
+        <w:t xml:space="preserve"> Play With Me</w:t>
+      </w:r>
+      <w:r>
+        <w:rPr>
+          <w:rFonts w:ascii="KaiTi" w:eastAsia="KaiTi" w:hAnsi="KaiTi" w:cs="Times New Roman" w:hint="eastAsia"/>
+          <w:sz w:val="22"/>
+          <w:szCs w:val="22"/>
+        </w:rPr>
+        <w:t xml:space="preserve"> </w:t>
+      </w:r>
+      <w:r>
+        <w:rPr>
+          <w:rFonts w:ascii="KaiTi" w:eastAsia="KaiTi" w:hAnsi="KaiTi" w:cs="Times New Roman" w:hint="eastAsia"/>
+          <w:sz w:val="22"/>
+          <w:szCs w:val="22"/>
+        </w:rPr>
+        <w:t>项目！</w:t>
+      </w:r>
+    </w:p>
+    <w:p>
+      <w:pPr>
+        <w:rPr>
+          <w:rFonts w:ascii="KaiTi" w:eastAsia="KaiTi" w:hAnsi="KaiTi" w:cs="Times New Roman"/>
+          <w:sz w:val="22"/>
+          <w:szCs w:val="22"/>
+        </w:rPr>
+      </w:pPr>
+      <w:r>
+        <w:rPr>
+          <w:rFonts w:ascii="KaiTi" w:eastAsia="KaiTi" w:hAnsi="KaiTi" w:cs="Times New Roman" w:hint="eastAsia"/>
+          <w:sz w:val="22"/>
+          <w:szCs w:val="22"/>
+        </w:rPr>
+        <w:t>作为项目的一部分，您为孩子填写了中、英文版MacArthur-Bates词汇发展量表（MCDI）词汇与句子的部分。这份词汇量表是针对8-30个月儿童的早期词汇发展筛查测量工具。</w:t>
+      </w:r>
+    </w:p>
+    <w:p>
+      <w:pPr>
+        <w:rPr>
+          <w:rFonts w:ascii="KaiTi" w:eastAsia="KaiTi" w:hAnsi="KaiTi" w:cs="Times New Roman"/>
+          <w:sz w:val="22"/>
+          <w:szCs w:val="22"/>
+        </w:rPr>
+      </w:pPr>
+    </w:p>
+    <w:p>
+      <w:pPr>
+        <w:rPr>
+          <w:rFonts w:ascii="KaiTi" w:eastAsia="KaiTi" w:hAnsi="KaiTi" w:cs="Times New Roman"/>
+          <w:sz w:val="22"/>
+          <w:szCs w:val="22"/>
+        </w:rPr>
+      </w:pPr>
+      <w:r>
+        <w:rPr>
+          <w:rFonts w:ascii="KaiTi" w:eastAsia="KaiTi" w:hAnsi="KaiTi" w:cs="Times New Roman" w:hint="eastAsia"/>
+          <w:sz w:val="22"/>
+          <w:szCs w:val="22"/>
+        </w:rPr>
+        <w:t>我们在下一页附上了孩子的词汇发展报告。</w:t>
+      </w:r>
+    </w:p>
+    <w:p>
+      <w:pPr>
+        <w:rPr>
+          <w:rFonts w:ascii="KaiTi" w:eastAsia="KaiTi" w:hAnsi="KaiTi" w:cs="Times New Roman"/>
+          <w:sz w:val="22"/>
+          <w:szCs w:val="22"/>
+        </w:rPr>
+      </w:pPr>
+    </w:p>
+    <w:p>
+      <w:pPr>
+        <w:rPr>
+          <w:rFonts w:ascii="KaiTi" w:eastAsia="KaiTi" w:hAnsi="KaiTi" w:cs="Times New Roman"/>
+          <w:b/>
+          <w:bCs/>
+          <w:sz w:val="22"/>
+          <w:szCs w:val="22"/>
+        </w:rPr>
+      </w:pPr>
+      <w:r>
+        <w:rPr>
+          <w:rFonts w:ascii="KaiTi" w:eastAsia="KaiTi" w:hAnsi="KaiTi" w:cs="Times New Roman"/>
+          <w:noProof/>
+          <w:sz w:val="22"/>
+          <w:szCs w:val="22"/>
+        </w:rPr>
+        <w:drawing>
+          <wp:anchor distT="0" distB="0" distL="114300" distR="114300" simplePos="0" relativeHeight="251668480" behindDoc="0" locked="0" layoutInCell="1" allowOverlap="1" wp14:anchorId="4232346A" wp14:editId="1B1193C3">
+            <wp:simplePos x="0" y="0"/>
+            <wp:positionH relativeFrom="column">
+              <wp:posOffset>28575</wp:posOffset>
+            </wp:positionH>
+            <wp:positionV relativeFrom="paragraph">
+              <wp:posOffset>6985</wp:posOffset>
+            </wp:positionV>
+            <wp:extent cx="365760" cy="365760"/>
+            <wp:effectExtent l="0" t="0" r="0" b="0"/>
+            <wp:wrapThrough wrapText="bothSides">
+              <wp:wrapPolygon edited="0">
+                <wp:start x="1125" y="0"/>
+                <wp:lineTo x="1125" y="20250"/>
+                <wp:lineTo x="19125" y="20250"/>
+                <wp:lineTo x="18000" y="5625"/>
+                <wp:lineTo x="14625" y="0"/>
+                <wp:lineTo x="1125" y="0"/>
+              </wp:wrapPolygon>
+            </wp:wrapThrough>
+            <wp:docPr id="1690786776" name="Graphic 6" descr="Document outline"/>
+            <wp:cNvGraphicFramePr>
+              <a:graphicFrameLocks xmlns:a="http://schemas.openxmlformats.org/drawingml/2006/main" noChangeAspect="1"/>
+            </wp:cNvGraphicFramePr>
+            <a:graphic xmlns:a="http://schemas.openxmlformats.org/drawingml/2006/main">
+              <a:graphicData uri="http://schemas.openxmlformats.org/drawingml/2006/picture">
+                <pic:pic xmlns:pic="http://schemas.openxmlformats.org/drawingml/2006/picture">
+                  <pic:nvPicPr>
+                    <pic:cNvPr id="2120008898" name="Graphic 2120008898" descr="Document outline"/>
+                    <pic:cNvPicPr/>
+                  </pic:nvPicPr>
+                  <pic:blipFill>
+                    <a:blip r:embed="rId7">
+                      <a:extLst>
+                        <a:ext uri="{96DAC541-7B7A-43D3-8B79-37D633B846F1}">
+                          <asvg:svgBlip xmlns:asvg="http://schemas.microsoft.com/office/drawing/2016/SVG/main" r:embed="rId8"/>
+                        </a:ext>
+                      </a:extLst>
+                    </a:blip>
+                    <a:stretch>
+                      <a:fillRect/>
+                    </a:stretch>
+                  </pic:blipFill>
+                  <pic:spPr>
+                    <a:xfrm>
+                      <a:off x="0" y="0"/>
+                      <a:ext cx="365760" cy="365760"/>
+                    </a:xfrm>
+                    <a:prstGeom prst="rect">
+                      <a:avLst/>
+                    </a:prstGeom>
+                  </pic:spPr>
+                </pic:pic>
+              </a:graphicData>
+            </a:graphic>
+            <wp14:sizeRelH relativeFrom="margin">
+              <wp14:pctWidth>0</wp14:pctWidth>
+            </wp14:sizeRelH>
+            <wp14:sizeRelV relativeFrom="margin">
+              <wp14:pctHeight>0</wp14:pctHeight>
+            </wp14:sizeRelV>
+          </wp:anchor>
+        </w:drawing>
+      </w:r>
+      <w:r>
+        <w:rPr>
+          <w:rFonts w:ascii="KaiTi" w:eastAsia="KaiTi" w:hAnsi="KaiTi" w:cs="Times New Roman" w:hint="eastAsia"/>
+          <w:b/>
+          <w:bCs/>
+          <w:sz w:val="22"/>
+          <w:szCs w:val="22"/>
+        </w:rPr>
+        <w:t>报告说明</w:t>
+      </w:r>
+      <w:r>
+        <w:rPr>
+          <w:rFonts w:ascii="KaiTi" w:eastAsia="KaiTi" w:hAnsi="KaiTi" w:cs="Times New Roman"/>
+          <w:b/>
+          <w:bCs/>
+          <w:sz w:val="22"/>
+          <w:szCs w:val="22"/>
+        </w:rPr>
+        <w:t xml:space="preserve">: </w:t>
+      </w:r>
+      <w:r>
+        <w:rPr>
+          <w:rFonts w:ascii="KaiTi" w:eastAsia="KaiTi" w:hAnsi="KaiTi" w:cs="Times New Roman" w:hint="eastAsia"/>
+          <w:sz w:val="22"/>
+          <w:szCs w:val="22"/>
+        </w:rPr>
+        <w:t>在这个报告中，我们汇总了孩子的中文和英文的词汇量。因为孩子接触两种不同的语言，我们也提供了一个总数，该数值反映了孩子在两种语言中知道的词汇的总和。以往的科学研究表明，在计算双语儿童词汇量时，相比仅测量和包括一种语言中知道的词汇量，使用两种语言中知道的词汇量的总和能更准确地更全面地描述儿童的语言发展。除了具体的词汇量，我们还提供了一个百分位数。这个数值代表着孩子的词汇量相对于在美国居住的同龄人来说处于什么水平。然而，目前临床上尚无针对同时学习普通话和英语双语儿童的应用常模。研究显示，双语儿童的两种语言的词汇总数的发展轨迹和单语儿童的词汇量类似。因此我们采用了对比孩子的词汇总数和英语儿童的常模来估算孩子的语言能力。</w:t>
+      </w:r>
+    </w:p>
+    <w:p>
+      <w:pPr>
+        <w:rPr>
+          <w:rFonts w:ascii="KaiTi" w:eastAsia="KaiTi" w:hAnsi="KaiTi" w:cs="Times New Roman"/>
+          <w:sz w:val="22"/>
+          <w:szCs w:val="22"/>
+        </w:rPr>
+      </w:pPr>
+    </w:p>
+    <w:p>
+      <w:pPr>
+        <w:rPr>
+          <w:rFonts w:ascii="KaiTi" w:eastAsia="KaiTi" w:hAnsi="KaiTi" w:cs="Times New Roman"/>
+          <w:b/>
+          <w:bCs/>
+          <w:sz w:val="22"/>
+          <w:szCs w:val="22"/>
+        </w:rPr>
+      </w:pPr>
+      <w:r>
+        <w:rPr>
+          <w:rFonts w:ascii="KaiTi" w:eastAsia="KaiTi" w:hAnsi="KaiTi" w:cs="Times New Roman"/>
+          <w:b/>
+          <w:bCs/>
+          <w:noProof/>
+          <w:sz w:val="22"/>
+          <w:szCs w:val="22"/>
+        </w:rPr>
+        <w:drawing>
+          <wp:anchor distT="0" distB="0" distL="114300" distR="114300" simplePos="0" relativeHeight="251667456" behindDoc="0" locked="0" layoutInCell="1" allowOverlap="1" wp14:anchorId="0C5E5DBC" wp14:editId="1B3EAA20">
+            <wp:simplePos x="0" y="0"/>
+            <wp:positionH relativeFrom="column">
+              <wp:posOffset>0</wp:posOffset>
+            </wp:positionH>
+            <wp:positionV relativeFrom="paragraph">
+              <wp:posOffset>-4445</wp:posOffset>
+            </wp:positionV>
+            <wp:extent cx="365760" cy="365760"/>
+            <wp:effectExtent l="0" t="0" r="0" b="0"/>
+            <wp:wrapThrough wrapText="bothSides">
+              <wp:wrapPolygon edited="0">
+                <wp:start x="4500" y="0"/>
+                <wp:lineTo x="1125" y="6750"/>
+                <wp:lineTo x="1125" y="13500"/>
+                <wp:lineTo x="4500" y="20250"/>
+                <wp:lineTo x="15750" y="20250"/>
+                <wp:lineTo x="20250" y="12375"/>
+                <wp:lineTo x="20250" y="7875"/>
+                <wp:lineTo x="15750" y="0"/>
+                <wp:lineTo x="4500" y="0"/>
+              </wp:wrapPolygon>
+            </wp:wrapThrough>
+            <wp:docPr id="1974156966" name="Graphic 5" descr="Help outline"/>
+            <wp:cNvGraphicFramePr>
+              <a:graphicFrameLocks xmlns:a="http://schemas.openxmlformats.org/drawingml/2006/main" noChangeAspect="1"/>
+            </wp:cNvGraphicFramePr>
+            <a:graphic xmlns:a="http://schemas.openxmlformats.org/drawingml/2006/main">
+              <a:graphicData uri="http://schemas.openxmlformats.org/drawingml/2006/picture">
+                <pic:pic xmlns:pic="http://schemas.openxmlformats.org/drawingml/2006/picture">
+                  <pic:nvPicPr>
+                    <pic:cNvPr id="1698409833" name="Graphic 1698409833" descr="Help outline"/>
+                    <pic:cNvPicPr/>
+                  </pic:nvPicPr>
+                  <pic:blipFill>
+                    <a:blip r:embed="rId9">
+                      <a:extLst>
+                        <a:ext uri="{96DAC541-7B7A-43D3-8B79-37D633B846F1}">
+                          <asvg:svgBlip xmlns:asvg="http://schemas.microsoft.com/office/drawing/2016/SVG/main" r:embed="rId10"/>
+                        </a:ext>
+                      </a:extLst>
+                    </a:blip>
+                    <a:stretch>
+                      <a:fillRect/>
+                    </a:stretch>
+                  </pic:blipFill>
+                  <pic:spPr>
+                    <a:xfrm>
+                      <a:off x="0" y="0"/>
+                      <a:ext cx="365760" cy="365760"/>
+                    </a:xfrm>
+                    <a:prstGeom prst="rect">
+                      <a:avLst/>
+                    </a:prstGeom>
+                  </pic:spPr>
+                </pic:pic>
+              </a:graphicData>
+            </a:graphic>
+          </wp:anchor>
+        </w:drawing>
+      </w:r>
+      <w:r>
+        <w:rPr>
+          <w:rFonts w:ascii="KaiTi" w:eastAsia="KaiTi" w:hAnsi="KaiTi" w:cs="Times New Roman"/>
+          <w:b/>
+          <w:bCs/>
+          <w:noProof/>
+          <w:sz w:val="22"/>
+          <w:szCs w:val="22"/>
+        </w:rPr>
+        <w:t xml:space="preserve">20% </w:t>
+      </w:r>
+      <w:r>
+        <w:rPr>
+          <w:rFonts w:ascii="KaiTi" w:eastAsia="KaiTi" w:hAnsi="KaiTi" w:cs="Times New Roman" w:hint="eastAsia"/>
+          <w:b/>
+          <w:bCs/>
+          <w:noProof/>
+          <w:sz w:val="22"/>
+          <w:szCs w:val="22"/>
+        </w:rPr>
+        <w:t>阈值代表</w:t>
+      </w:r>
+      <w:r>
+        <w:rPr>
+          <w:rFonts w:ascii="KaiTi" w:eastAsia="KaiTi" w:hAnsi="KaiTi" w:cs="Times New Roman"/>
+          <w:b/>
+          <w:bCs/>
+          <w:noProof/>
+          <w:sz w:val="22"/>
+          <w:szCs w:val="22"/>
+        </w:rPr>
+        <w:t>着什么？</w:t>
+      </w:r>
+      <w:r>
+        <w:rPr>
+          <w:rFonts w:ascii="KaiTi" w:eastAsia="KaiTi" w:hAnsi="KaiTi" w:cs="Times New Roman"/>
+          <w:b/>
+          <w:bCs/>
+          <w:sz w:val="22"/>
+          <w:szCs w:val="22"/>
+        </w:rPr>
+        <w:t xml:space="preserve"> </w:t>
+      </w:r>
+      <w:r>
+        <w:rPr>
+          <w:rFonts w:ascii="KaiTi" w:eastAsia="KaiTi" w:hAnsi="KaiTi" w:cs="Times New Roman"/>
+          <w:sz w:val="22"/>
+          <w:szCs w:val="22"/>
+        </w:rPr>
+        <w:t>在研究和早期筛查中，综合词汇得分低于第 20 百分位通常被用作一个参考标准，用于识别可能存在语言发育迟缓风险的双语儿童。您孩子的结果显示，其词汇水平低于这一 20% 的阈值，这意味着与同龄儿童相比，</w:t>
+      </w:r>
+      <w:r>
+        <w:rPr>
+          <w:rFonts w:ascii="KaiTi" w:eastAsia="KaiTi" w:hAnsi="KaiTi" w:cs="Times New Roman" w:hint="eastAsia"/>
+          <w:sz w:val="22"/>
+          <w:szCs w:val="22"/>
+        </w:rPr>
+        <w:t>他/她</w:t>
+      </w:r>
+      <w:r>
+        <w:rPr>
+          <w:rFonts w:ascii="KaiTi" w:eastAsia="KaiTi" w:hAnsi="KaiTi" w:cs="Times New Roman"/>
+          <w:sz w:val="22"/>
+          <w:szCs w:val="22"/>
+        </w:rPr>
+        <w:t>的语言能力发展可能较为缓慢。</w:t>
+      </w:r>
+      <w:r>
+        <w:rPr>
+          <w:rFonts w:ascii="KaiTi" w:eastAsia="KaiTi" w:hAnsi="KaiTi" w:cs="Times New Roman" w:hint="eastAsia"/>
+          <w:sz w:val="22"/>
+          <w:szCs w:val="22"/>
+        </w:rPr>
+        <w:t>请注意，</w:t>
+      </w:r>
+      <w:r>
+        <w:rPr>
+          <w:rFonts w:ascii="KaiTi" w:eastAsia="KaiTi" w:hAnsi="KaiTi" w:cs="Times New Roman"/>
+          <w:sz w:val="22"/>
+          <w:szCs w:val="22"/>
+        </w:rPr>
+        <w:t>仅为对您孩子语言发展情况的描述性总结，用于初步评估</w:t>
+      </w:r>
+      <w:r>
+        <w:rPr>
+          <w:rFonts w:ascii="KaiTi" w:eastAsia="KaiTi" w:hAnsi="KaiTi" w:cs="Times New Roman" w:hint="eastAsia"/>
+          <w:sz w:val="22"/>
+          <w:szCs w:val="22"/>
+        </w:rPr>
+        <w:t>，旨在</w:t>
+      </w:r>
+      <w:r>
+        <w:rPr>
+          <w:rFonts w:ascii="KaiTi" w:eastAsia="KaiTi" w:hAnsi="KaiTi" w:cs="Times New Roman"/>
+          <w:sz w:val="22"/>
+          <w:szCs w:val="22"/>
+        </w:rPr>
+        <w:t>帮助判断孩子是否可能需要额外支持的第一步</w:t>
+      </w:r>
+      <w:r>
+        <w:rPr>
+          <w:rFonts w:ascii="KaiTi" w:eastAsia="KaiTi" w:hAnsi="KaiTi" w:cs="Times New Roman" w:hint="eastAsia"/>
+          <w:sz w:val="22"/>
+          <w:szCs w:val="22"/>
+        </w:rPr>
+        <w:t>，</w:t>
+      </w:r>
+      <w:r>
+        <w:rPr>
+          <w:rFonts w:ascii="KaiTi" w:eastAsia="KaiTi" w:hAnsi="KaiTi" w:cs="Times New Roman" w:hint="eastAsia"/>
+          <w:b/>
+          <w:bCs/>
+          <w:sz w:val="22"/>
+          <w:szCs w:val="22"/>
+        </w:rPr>
+        <w:t>不适用于临床诊断目的</w:t>
+      </w:r>
+      <w:r>
+        <w:rPr>
+          <w:rFonts w:ascii="KaiTi" w:eastAsia="KaiTi" w:hAnsi="KaiTi" w:cs="Times New Roman"/>
+          <w:sz w:val="22"/>
+          <w:szCs w:val="22"/>
+        </w:rPr>
+        <w:t>。</w:t>
+      </w:r>
+    </w:p>
+    <w:p>
+      <w:pPr>
+        <w:rPr>
+          <w:rFonts w:ascii="KaiTi" w:eastAsia="KaiTi" w:hAnsi="KaiTi" w:cs="Times New Roman"/>
+          <w:sz w:val="22"/>
+          <w:szCs w:val="22"/>
+        </w:rPr>
+      </w:pPr>
+    </w:p>
+    <w:p>
+      <w:pPr>
+        <w:rPr>
+          <w:rFonts w:ascii="KaiTi" w:eastAsia="KaiTi" w:hAnsi="KaiTi" w:cs="Times New Roman"/>
+          <w:b/>
+          <w:bCs/>
+          <w:sz w:val="22"/>
+          <w:szCs w:val="22"/>
+        </w:rPr>
+      </w:pPr>
+      <w:r>
+        <w:rPr>
+          <w:rFonts w:ascii="KaiTi" w:eastAsia="KaiTi" w:hAnsi="KaiTi" w:cs="Times New Roman"/>
+          <w:noProof/>
+          <w:sz w:val="22"/>
+          <w:szCs w:val="22"/>
+        </w:rPr>
+        <w:drawing>
+          <wp:anchor distT="0" distB="0" distL="114300" distR="114300" simplePos="0" relativeHeight="251665408" behindDoc="0" locked="0" layoutInCell="1" allowOverlap="1" wp14:anchorId="4E114346" wp14:editId="074EB05F">
+            <wp:simplePos x="0" y="0"/>
+            <wp:positionH relativeFrom="column">
+              <wp:posOffset>0</wp:posOffset>
+            </wp:positionH>
+            <wp:positionV relativeFrom="paragraph">
+              <wp:posOffset>6985</wp:posOffset>
+            </wp:positionV>
+            <wp:extent cx="365760" cy="365760"/>
+            <wp:effectExtent l="0" t="0" r="0" b="0"/>
+            <wp:wrapThrough wrapText="bothSides">
+              <wp:wrapPolygon edited="0">
+                <wp:start x="7875" y="0"/>
+                <wp:lineTo x="0" y="4500"/>
+                <wp:lineTo x="0" y="15750"/>
+                <wp:lineTo x="6750" y="20250"/>
+                <wp:lineTo x="13500" y="20250"/>
+                <wp:lineTo x="13500" y="18000"/>
+                <wp:lineTo x="20250" y="13500"/>
+                <wp:lineTo x="20250" y="5625"/>
+                <wp:lineTo x="12375" y="0"/>
+                <wp:lineTo x="7875" y="0"/>
+              </wp:wrapPolygon>
+            </wp:wrapThrough>
+            <wp:docPr id="604117134" name="Graphic 3" descr="Lightbulb and gear outline"/>
+            <wp:cNvGraphicFramePr>
+              <a:graphicFrameLocks xmlns:a="http://schemas.openxmlformats.org/drawingml/2006/main" noChangeAspect="1"/>
+            </wp:cNvGraphicFramePr>
+            <a:graphic xmlns:a="http://schemas.openxmlformats.org/drawingml/2006/main">
+              <a:graphicData uri="http://schemas.openxmlformats.org/drawingml/2006/picture">
+                <pic:pic xmlns:pic="http://schemas.openxmlformats.org/drawingml/2006/picture">
+                  <pic:nvPicPr>
+                    <pic:cNvPr id="1034815981" name="Graphic 1034815981" descr="Lightbulb and gear outline"/>
+                    <pic:cNvPicPr/>
+                  </pic:nvPicPr>
+                  <pic:blipFill>
+                    <a:blip r:embed="rId11">
+                      <a:extLst>
+                        <a:ext uri="{96DAC541-7B7A-43D3-8B79-37D633B846F1}">
+                          <asvg:svgBlip xmlns:asvg="http://schemas.microsoft.com/office/drawing/2016/SVG/main" r:embed="rId12"/>
+                        </a:ext>
+                      </a:extLst>
+                    </a:blip>
+                    <a:stretch>
+                      <a:fillRect/>
+                    </a:stretch>
+                  </pic:blipFill>
+                  <pic:spPr>
+                    <a:xfrm>
+                      <a:off x="0" y="0"/>
+                      <a:ext cx="365760" cy="365760"/>
+                    </a:xfrm>
+                    <a:prstGeom prst="rect">
+                      <a:avLst/>
+                    </a:prstGeom>
+                  </pic:spPr>
+                </pic:pic>
+              </a:graphicData>
+            </a:graphic>
+            <wp14:sizeRelH relativeFrom="margin">
+              <wp14:pctWidth>0</wp14:pctWidth>
+            </wp14:sizeRelH>
+            <wp14:sizeRelV relativeFrom="margin">
+              <wp14:pctHeight>0</wp14:pctHeight>
+            </wp14:sizeRelV>
+          </wp:anchor>
+        </w:drawing>
+      </w:r>
+      <w:r>
+        <w:rPr>
+          <w:rFonts w:ascii="KaiTi" w:eastAsia="KaiTi" w:hAnsi="KaiTi" w:cs="Times New Roman" w:hint="eastAsia"/>
+          <w:b/>
+          <w:bCs/>
+          <w:sz w:val="22"/>
+          <w:szCs w:val="22"/>
+        </w:rPr>
+        <w:t>需要注意的事项</w:t>
+      </w:r>
+      <w:r>
+        <w:rPr>
+          <w:rFonts w:ascii="KaiTi" w:eastAsia="KaiTi" w:hAnsi="KaiTi" w:cs="Times New Roman"/>
+          <w:b/>
+          <w:bCs/>
+          <w:sz w:val="22"/>
+          <w:szCs w:val="22"/>
+        </w:rPr>
+        <w:t xml:space="preserve">: </w:t>
+      </w:r>
+      <w:r>
+        <w:rPr>
+          <w:rFonts w:ascii="KaiTi" w:eastAsia="KaiTi" w:hAnsi="KaiTi" w:cs="Times New Roman"/>
+          <w:sz w:val="22"/>
+          <w:szCs w:val="22"/>
+        </w:rPr>
+        <w:t>儿童语言发展的速度各不相同</w:t>
+      </w:r>
+      <w:r>
+        <w:rPr>
+          <w:rFonts w:ascii="KaiTi" w:eastAsia="KaiTi" w:hAnsi="KaiTi" w:cs="Times New Roman" w:hint="eastAsia"/>
+          <w:sz w:val="22"/>
+          <w:szCs w:val="22"/>
+        </w:rPr>
+        <w:t>，</w:t>
+      </w:r>
+      <w:r>
+        <w:rPr>
+          <w:rFonts w:ascii="KaiTi" w:eastAsia="KaiTi" w:hAnsi="KaiTi" w:cs="Times New Roman"/>
+          <w:sz w:val="22"/>
+          <w:szCs w:val="22"/>
+        </w:rPr>
+        <w:t>尤其是在同时学习多种语言的情况下。许多因素都会影响语言发展，包括年龄、性别、家庭中每种语言的使用频率等。</w:t>
+      </w:r>
+      <w:r>
+        <w:rPr>
+          <w:rFonts w:ascii="KaiTi" w:eastAsia="KaiTi" w:hAnsi="KaiTi" w:cs="Times New Roman" w:hint="eastAsia"/>
+          <w:sz w:val="22"/>
+          <w:szCs w:val="22"/>
+        </w:rPr>
+        <w:t>随着年龄的增长，</w:t>
+      </w:r>
+      <w:r>
+        <w:rPr>
+          <w:rFonts w:ascii="KaiTi" w:eastAsia="KaiTi" w:hAnsi="KaiTi" w:cs="Times New Roman" w:hint="eastAsia"/>
+          <w:sz w:val="22"/>
+          <w:szCs w:val="22"/>
+        </w:rPr>
+        <w:t>部分语言发育迟缓</w:t>
+      </w:r>
+      <w:r>
+        <w:rPr>
+          <w:rFonts w:ascii="KaiTi" w:eastAsia="KaiTi" w:hAnsi="KaiTi" w:cs="Times New Roman"/>
+          <w:sz w:val="22"/>
+          <w:szCs w:val="22"/>
+        </w:rPr>
+        <w:t>儿童会赶上同龄人</w:t>
+      </w:r>
+      <w:r>
+        <w:rPr>
+          <w:rFonts w:ascii="KaiTi" w:eastAsia="KaiTi" w:hAnsi="KaiTi" w:cs="Times New Roman" w:hint="eastAsia"/>
+          <w:sz w:val="22"/>
+          <w:szCs w:val="22"/>
+        </w:rPr>
+        <w:t>的语言</w:t>
+      </w:r>
+      <w:r>
+        <w:rPr>
+          <w:rFonts w:ascii="KaiTi" w:eastAsia="KaiTi" w:hAnsi="KaiTi" w:cs="Times New Roman" w:hint="eastAsia"/>
+          <w:sz w:val="22"/>
+          <w:szCs w:val="22"/>
+        </w:rPr>
+        <w:t>发展进程</w:t>
+      </w:r>
+      <w:r>
+        <w:rPr>
+          <w:rFonts w:ascii="KaiTi" w:eastAsia="KaiTi" w:hAnsi="KaiTi" w:cs="Times New Roman"/>
+          <w:sz w:val="22"/>
+          <w:szCs w:val="22"/>
+        </w:rPr>
+        <w:t>，而另一</w:t>
+      </w:r>
+      <w:r>
+        <w:rPr>
+          <w:rFonts w:ascii="KaiTi" w:eastAsia="KaiTi" w:hAnsi="KaiTi" w:cs="Times New Roman" w:hint="eastAsia"/>
+          <w:sz w:val="22"/>
+          <w:szCs w:val="22"/>
+        </w:rPr>
+        <w:t>部分</w:t>
+      </w:r>
+      <w:r>
+        <w:rPr>
+          <w:rFonts w:ascii="KaiTi" w:eastAsia="KaiTi" w:hAnsi="KaiTi" w:cs="Times New Roman"/>
+          <w:sz w:val="22"/>
+          <w:szCs w:val="22"/>
+        </w:rPr>
+        <w:t>则可能持续存在语言发展</w:t>
+      </w:r>
+      <w:r>
+        <w:rPr>
+          <w:rFonts w:ascii="KaiTi" w:eastAsia="KaiTi" w:hAnsi="KaiTi" w:cs="Times New Roman" w:hint="eastAsia"/>
+          <w:sz w:val="22"/>
+          <w:szCs w:val="22"/>
+        </w:rPr>
+        <w:t>方面的</w:t>
+      </w:r>
+      <w:r>
+        <w:rPr>
+          <w:rFonts w:ascii="KaiTi" w:eastAsia="KaiTi" w:hAnsi="KaiTi" w:cs="Times New Roman"/>
+          <w:sz w:val="22"/>
+          <w:szCs w:val="22"/>
+        </w:rPr>
+        <w:t>困难，并</w:t>
+      </w:r>
+      <w:r>
+        <w:rPr>
+          <w:rFonts w:ascii="KaiTi" w:eastAsia="KaiTi" w:hAnsi="KaiTi" w:cs="Times New Roman" w:hint="eastAsia"/>
+          <w:sz w:val="22"/>
+          <w:szCs w:val="22"/>
+        </w:rPr>
+        <w:t>需要</w:t>
+      </w:r>
+      <w:r>
+        <w:rPr>
+          <w:rFonts w:ascii="KaiTi" w:eastAsia="KaiTi" w:hAnsi="KaiTi" w:cs="Times New Roman"/>
+          <w:sz w:val="22"/>
+          <w:szCs w:val="22"/>
+        </w:rPr>
+        <w:t>早期</w:t>
+      </w:r>
+      <w:r>
+        <w:rPr>
+          <w:rFonts w:ascii="KaiTi" w:eastAsia="KaiTi" w:hAnsi="KaiTi" w:cs="Times New Roman" w:hint="eastAsia"/>
+          <w:sz w:val="22"/>
+          <w:szCs w:val="22"/>
+        </w:rPr>
+        <w:t>干预</w:t>
+      </w:r>
+      <w:r>
+        <w:rPr>
+          <w:rFonts w:ascii="KaiTi" w:eastAsia="KaiTi" w:hAnsi="KaiTi" w:cs="Times New Roman"/>
+          <w:sz w:val="22"/>
+          <w:szCs w:val="22"/>
+        </w:rPr>
+        <w:t>和额外的支持。</w:t>
+      </w:r>
+    </w:p>
+    <w:p>
+      <w:pPr>
+        <w:rPr>
+          <w:rFonts w:ascii="KaiTi" w:eastAsia="KaiTi" w:hAnsi="KaiTi" w:cs="Times New Roman"/>
+          <w:sz w:val="22"/>
+          <w:szCs w:val="22"/>
+        </w:rPr>
+      </w:pPr>
+      <w:r>
+        <w:rPr>
+          <w:rFonts w:ascii="KaiTi" w:eastAsia="KaiTi" w:hAnsi="KaiTi" w:cs="Times New Roman"/>
+          <w:noProof/>
+          <w:sz w:val="22"/>
+          <w:szCs w:val="22"/>
+        </w:rPr>
+        <w:drawing>
+          <wp:anchor distT="0" distB="0" distL="114300" distR="114300" simplePos="0" relativeHeight="251666432" behindDoc="0" locked="0" layoutInCell="1" allowOverlap="1" wp14:anchorId="70D0DB1D" wp14:editId="1772E6FE">
+            <wp:simplePos x="0" y="0"/>
+            <wp:positionH relativeFrom="column">
+              <wp:posOffset>32385</wp:posOffset>
+            </wp:positionH>
+            <wp:positionV relativeFrom="paragraph">
+              <wp:posOffset>172720</wp:posOffset>
+            </wp:positionV>
+            <wp:extent cx="365760" cy="365760"/>
+            <wp:effectExtent l="0" t="0" r="0" b="0"/>
+            <wp:wrapThrough wrapText="bothSides">
+              <wp:wrapPolygon edited="0">
+                <wp:start x="5625" y="0"/>
+                <wp:lineTo x="2250" y="4500"/>
+                <wp:lineTo x="3375" y="15750"/>
+                <wp:lineTo x="11250" y="20250"/>
+                <wp:lineTo x="16875" y="20250"/>
+                <wp:lineTo x="18000" y="9000"/>
+                <wp:lineTo x="10125" y="0"/>
+                <wp:lineTo x="5625" y="0"/>
+              </wp:wrapPolygon>
+            </wp:wrapThrough>
+            <wp:docPr id="133898627" name="Graphic 4" descr="Footprints outline"/>
+            <wp:cNvGraphicFramePr>
+              <a:graphicFrameLocks xmlns:a="http://schemas.openxmlformats.org/drawingml/2006/main" noChangeAspect="1"/>
+            </wp:cNvGraphicFramePr>
+            <a:graphic xmlns:a="http://schemas.openxmlformats.org/drawingml/2006/main">
+              <a:graphicData uri="http://schemas.openxmlformats.org/drawingml/2006/picture">
+                <pic:pic xmlns:pic="http://schemas.openxmlformats.org/drawingml/2006/picture">
+                  <pic:nvPicPr>
+                    <pic:cNvPr id="578437347" name="Graphic 578437347" descr="Footprints outline"/>
+                    <pic:cNvPicPr/>
+                  </pic:nvPicPr>
+                  <pic:blipFill>
+                    <a:blip r:embed="rId13">
+                      <a:extLst>
+                        <a:ext uri="{96DAC541-7B7A-43D3-8B79-37D633B846F1}">
+                          <asvg:svgBlip xmlns:asvg="http://schemas.microsoft.com/office/drawing/2016/SVG/main" r:embed="rId14"/>
+                        </a:ext>
+                      </a:extLst>
+                    </a:blip>
+                    <a:stretch>
+                      <a:fillRect/>
+                    </a:stretch>
+                  </pic:blipFill>
+                  <pic:spPr>
+                    <a:xfrm>
+                      <a:off x="0" y="0"/>
+                      <a:ext cx="365760" cy="365760"/>
+                    </a:xfrm>
+                    <a:prstGeom prst="rect">
+                      <a:avLst/>
+                    </a:prstGeom>
+                  </pic:spPr>
+                </pic:pic>
+              </a:graphicData>
+            </a:graphic>
+          </wp:anchor>
+        </w:drawing>
+      </w:r>
+    </w:p>
+    <w:p>
+      <w:pPr>
+        <w:rPr>
+          <w:rFonts w:ascii="KaiTi" w:eastAsia="KaiTi" w:hAnsi="KaiTi" w:cs="Times New Roman"/>
+          <w:b/>
+          <w:bCs/>
+          <w:sz w:val="22"/>
+          <w:szCs w:val="22"/>
+        </w:rPr>
+      </w:pPr>
+      <w:r>
+        <w:rPr>
+          <w:rFonts w:ascii="KaiTi" w:eastAsia="KaiTi" w:hAnsi="KaiTi" w:cs="Times New Roman" w:hint="eastAsia"/>
+          <w:b/>
+          <w:bCs/>
+          <w:sz w:val="22"/>
+          <w:szCs w:val="22"/>
+        </w:rPr>
+        <w:t>下一步建议</w:t>
+      </w:r>
+      <w:r>
+        <w:rPr>
+          <w:rFonts w:ascii="KaiTi" w:eastAsia="KaiTi" w:hAnsi="KaiTi" w:cs="Times New Roman"/>
+          <w:b/>
+          <w:bCs/>
+          <w:sz w:val="22"/>
+          <w:szCs w:val="22"/>
+        </w:rPr>
+        <w:t xml:space="preserve">: </w:t>
+      </w:r>
+      <w:r>
+        <w:rPr>
+          <w:rFonts w:ascii="KaiTi" w:eastAsia="KaiTi" w:hAnsi="KaiTi" w:cs="Times New Roman"/>
+          <w:sz w:val="22"/>
+          <w:szCs w:val="22"/>
+        </w:rPr>
+        <w:t>如果您对孩子的语言发展有任何担忧，我们建议您联系当地的早期儿童干预（ECI）项目，他们可以提供更为全面的语言评估。如有条件，建议尽量寻求由双语语言</w:t>
+      </w:r>
+      <w:r>
+        <w:rPr>
+          <w:rFonts w:ascii="KaiTi" w:eastAsia="KaiTi" w:hAnsi="KaiTi" w:cs="Times New Roman" w:hint="eastAsia"/>
+          <w:sz w:val="22"/>
+          <w:szCs w:val="22"/>
+        </w:rPr>
+        <w:t>治疗师</w:t>
+      </w:r>
+      <w:r>
+        <w:rPr>
+          <w:rFonts w:ascii="KaiTi" w:eastAsia="KaiTi" w:hAnsi="KaiTi" w:cs="Times New Roman"/>
+          <w:sz w:val="22"/>
+          <w:szCs w:val="22"/>
+        </w:rPr>
+        <w:t>进行评估。</w:t>
+      </w:r>
+    </w:p>
+    <w:p>
+      <w:pPr>
+        <w:rPr>
+          <w:rFonts w:ascii="KaiTi" w:eastAsia="KaiTi" w:hAnsi="KaiTi" w:cs="Times New Roman"/>
+          <w:sz w:val="22"/>
+          <w:szCs w:val="22"/>
+        </w:rPr>
+      </w:pPr>
+    </w:p>
+    <w:p>
+      <w:pPr>
+        <w:rPr>
+          <w:rFonts w:ascii="KaiTi" w:eastAsia="KaiTi" w:hAnsi="KaiTi" w:cs="Times New Roman"/>
+          <w:sz w:val="22"/>
+          <w:szCs w:val="22"/>
+        </w:rPr>
+      </w:pPr>
+      <w:r>
+        <w:rPr>
+          <w:rFonts w:ascii="KaiTi" w:eastAsia="KaiTi" w:hAnsi="KaiTi" w:cs="Times New Roman"/>
+          <w:sz w:val="22"/>
+          <w:szCs w:val="22"/>
+        </w:rPr>
+        <w:t>再次感谢您抽出时间参与本次评估。我们希望本报告能对您了解孩子的语言发展情况有所帮助。</w:t>
+      </w:r>
+    </w:p>
+    <w:p>
+      <w:pPr>
+        <w:rPr>
+          <w:rFonts w:ascii="KaiTi" w:eastAsia="KaiTi" w:hAnsi="KaiTi" w:cs="Times New Roman"/>
+          <w:sz w:val="22"/>
+          <w:szCs w:val="22"/>
+        </w:rPr>
+      </w:pPr>
+    </w:p>
+    <w:p>
+      <w:pPr>
+        <w:rPr>
+          <w:rFonts w:ascii="KaiTi" w:eastAsia="KaiTi" w:hAnsi="KaiTi" w:cs="Times New Roman"/>
+          <w:sz w:val="22"/>
+          <w:szCs w:val="22"/>
+          <w:shd w:val="clear" w:color="auto" w:fill="FFFFFF"/>
+        </w:rPr>
+      </w:pPr>
+      <w:r>
+        <w:rPr>
+          <w:rFonts w:ascii="KaiTi" w:eastAsia="KaiTi" w:hAnsi="KaiTi" w:cs="SimSun" w:hint="eastAsia"/>
+          <w:sz w:val="22"/>
+          <w:szCs w:val="22"/>
+          <w:shd w:val="clear" w:color="auto" w:fill="FFFFFF"/>
+        </w:rPr>
+        <w:t>感谢，祝好</w:t>
+      </w:r>
+      <w:r>
+        <w:rPr>
+          <w:rFonts w:ascii="KaiTi" w:eastAsia="KaiTi" w:hAnsi="KaiTi" w:cs="Times New Roman"/>
+          <w:sz w:val="22"/>
+          <w:szCs w:val="22"/>
+          <w:shd w:val="clear" w:color="auto" w:fill="FFFFFF"/>
+        </w:rPr>
+        <w:t xml:space="preserve">, </w:t>
+      </w:r>
+    </w:p>
+    <w:p>
+      <w:pPr>
+        <w:rPr>
+          <w:rFonts w:ascii="KaiTi" w:eastAsia="KaiTi" w:hAnsi="KaiTi" w:cs="Times New Roman"/>
+          <w:sz w:val="22"/>
+          <w:szCs w:val="22"/>
+          <w:shd w:val="clear" w:color="auto" w:fill="FFFFFF"/>
+        </w:rPr>
+      </w:pPr>
+    </w:p>
+    <w:p>
+      <w:pPr>
+        <w:rPr>
+          <w:rFonts w:ascii="KaiTi" w:eastAsia="KaiTi" w:hAnsi="KaiTi" w:cs="Times New Roman"/>
+          <w:sz w:val="22"/>
+          <w:szCs w:val="22"/>
+          <w:shd w:val="clear" w:color="auto" w:fill="FFFFFF"/>
+        </w:rPr>
+      </w:pPr>
+      <w:r>
+        <w:rPr>
+          <w:rFonts w:ascii="KaiTi" w:eastAsia="KaiTi" w:hAnsi="KaiTi" w:cs="SimSun" w:hint="eastAsia"/>
+          <w:sz w:val="22"/>
+          <w:szCs w:val="22"/>
+          <w:shd w:val="clear" w:color="auto" w:fill="FFFFFF"/>
+        </w:rPr>
+        <w:t>儿童与家庭中心（</w:t>
+      </w:r>
+      <w:r>
+        <w:rPr>
+          <w:rFonts w:ascii="KaiTi" w:eastAsia="KaiTi" w:hAnsi="KaiTi" w:cs="Times New Roman"/>
+          <w:sz w:val="22"/>
+          <w:szCs w:val="22"/>
+          <w:shd w:val="clear" w:color="auto" w:fill="FFFFFF"/>
+        </w:rPr>
+        <w:t>The Center for Children and Families</w:t>
+      </w:r>
+      <w:r>
+        <w:rPr>
+          <w:rFonts w:ascii="KaiTi" w:eastAsia="KaiTi" w:hAnsi="KaiTi" w:cs="SimSun" w:hint="eastAsia"/>
+          <w:sz w:val="22"/>
+          <w:szCs w:val="22"/>
+          <w:shd w:val="clear" w:color="auto" w:fill="FFFFFF"/>
+        </w:rPr>
+        <w:t>）</w:t>
+      </w:r>
+    </w:p>
+    <w:p>
+      <w:pPr>
+        <w:rPr>
+          <w:rFonts w:ascii="KaiTi" w:eastAsia="KaiTi" w:hAnsi="KaiTi" w:cs="Arial"/>
+          <w:sz w:val="21"/>
+          <w:szCs w:val="21"/>
+          <w:shd w:val="clear" w:color="auto" w:fill="FFFFFF"/>
+        </w:rPr>
+      </w:pPr>
+      <w:r>
+        <w:rPr>
+          <w:rFonts w:ascii="KaiTi" w:eastAsia="KaiTi" w:hAnsi="KaiTi"/>
+        </w:rPr>
+        <w:br w:type="page"/>
+      </w:r>
+    </w:p>
+    <w:p>
       <w:pPr>
         <w:tabs>
           <w:tab w:val="left" w:pos="2680"/>
         </w:tabs>
       </w:pPr>
     </w:p>
+    <w:tbl>
+      <w:tblPr>
+        <w:tblStyle w:val="TableGrid"/>
+        <w:tblW w:w="0" w:type="auto"/>
+        <w:tblLook w:val="04A0" w:firstRow="1" w:lastRow="0" w:firstColumn="1" w:lastColumn="0" w:noHBand="0" w:noVBand="1"/>
+      </w:tblPr>
+      <w:tblGrid>
+        <w:gridCol w:w="9350"/>
+      </w:tblGrid>
+      <w:tr>
+        <w:tc>
+          <w:tcPr>
+            <w:tcW w:w="9350" w:type="dxa"/>
+          </w:tcPr>
+          <w:p>
+            <w:pPr>
+              <w:tabs>
+                <w:tab w:val="left" w:pos="2680"/>
+              </w:tabs>
+              <w:jc w:val="center"/>
+              <w:rPr>
+                <w:rFonts w:ascii="KaiTi" w:eastAsia="KaiTi" w:hAnsi="KaiTi" w:cs="Arial"/>
+                <w:b/>
+                <w:bCs/>
+              </w:rPr>
+            </w:pPr>
+            <w:r>
+              <w:rPr>
+                <w:rFonts w:ascii="KaiTi" w:eastAsia="KaiTi" w:hAnsi="KaiTi" w:cs="Arial" w:hint="eastAsia"/>
+                <w:b/>
+                <w:bCs/>
+              </w:rPr>
+              <w:t>MacArthur-Bates</w:t>
+            </w:r>
+            <w:r>
+              <w:rPr>
+                <w:rFonts w:ascii="Calibri" w:eastAsia="KaiTi" w:hAnsi="Calibri" w:cs="Calibri"/>
+                <w:b/>
+                <w:bCs/>
+              </w:rPr>
+              <w:t> </w:t>
+            </w:r>
+            <w:r>
+              <w:rPr>
+                <w:rFonts w:ascii="KaiTi" w:eastAsia="KaiTi" w:hAnsi="KaiTi" w:cs="Arial" w:hint="eastAsia"/>
+                <w:b/>
+                <w:bCs/>
+              </w:rPr>
+              <w:t>词汇量表词汇与</w:t>
+            </w:r>
+            <w:r>
+              <w:rPr>
+                <w:rFonts w:ascii="KaiTi" w:eastAsia="KaiTi" w:hAnsi="KaiTi" w:cs="Arial" w:hint="eastAsia"/>
+                <w:b/>
+                <w:bCs/>
+              </w:rPr>
+              <w:t>句子</w:t>
+            </w:r>
+            <w:r>
+              <w:rPr>
+                <w:rFonts w:ascii="Calibri" w:eastAsia="KaiTi" w:hAnsi="Calibri" w:cs="Calibri"/>
+                <w:b/>
+                <w:bCs/>
+              </w:rPr>
+              <w:t> </w:t>
+            </w:r>
+          </w:p>
+          <w:p>
+            <w:pPr>
+              <w:tabs>
+                <w:tab w:val="left" w:pos="2680"/>
+              </w:tabs>
+              <w:jc w:val="center"/>
+              <w:rPr>
+                <w:rFonts w:ascii="KaiTi" w:eastAsia="KaiTi" w:hAnsi="KaiTi" w:cs="Arial"/>
+                <w:b/>
+                <w:bCs/>
+              </w:rPr>
+            </w:pPr>
+            <w:r>
+              <w:rPr>
+                <w:rFonts w:ascii="KaiTi" w:eastAsia="KaiTi" w:hAnsi="KaiTi" w:cs="Arial" w:hint="eastAsia"/>
+                <w:b/>
+                <w:bCs/>
+              </w:rPr>
+              <w:t>英文-中文</w:t>
+            </w:r>
+            <w:r>
+              <w:rPr>
+                <w:rFonts w:ascii="Calibri" w:eastAsia="KaiTi" w:hAnsi="Calibri" w:cs="Calibri"/>
+                <w:b/>
+                <w:bCs/>
+              </w:rPr>
+              <w:t> </w:t>
+            </w:r>
+          </w:p>
+          <w:p>
+            <w:pPr>
+              <w:tabs>
+                <w:tab w:val="left" w:pos="2680"/>
+              </w:tabs>
+              <w:jc w:val="center"/>
+              <w:rPr>
+                <w:rFonts w:ascii="KaiTi" w:eastAsia="KaiTi" w:hAnsi="KaiTi" w:cs="Arial"/>
+                <w:b/>
+                <w:bCs/>
+              </w:rPr>
+            </w:pPr>
+            <w:r>
+              <w:rPr>
+                <w:rFonts w:ascii="KaiTi" w:eastAsia="KaiTi" w:hAnsi="KaiTi" w:cs="Arial" w:hint="eastAsia"/>
+                <w:b/>
+                <w:bCs/>
+                <w:i/>
+                <w:iCs/>
+              </w:rPr>
+              <w:t>测评报告</w:t>
+            </w:r>
+          </w:p>
+        </w:tc>
+      </w:tr>
+    </w:tbl>
+    <w:p>
+      <w:pPr>
+        <w:tabs>
+          <w:tab w:val="left" w:pos="2680"/>
+        </w:tabs>
+        <w:rPr>
+          <w:rFonts w:ascii="KaiTi" w:eastAsia="KaiTi" w:hAnsi="KaiTi" w:cs="Arial"/>
+        </w:rPr>
+      </w:pPr>
+    </w:p>
+    <w:tbl>
+      <w:tblPr>
+        <w:tblStyle w:val="TableGrid"/>
+        <w:tblW w:w="0" w:type="auto"/>
+        <w:tblLook w:val="04A0" w:firstRow="1" w:lastRow="0" w:firstColumn="1" w:lastColumn="0" w:noHBand="0" w:noVBand="1"/>
+      </w:tblPr>
+      <w:tblGrid>
+        <w:gridCol w:w="4495"/>
+        <w:gridCol w:w="4855"/>
+      </w:tblGrid>
+      <w:tr>
+        <w:tc>
+          <w:tcPr>
+            <w:tcW w:w="4495" w:type="dxa"/>
+          </w:tcPr>
+          <w:p>
+            <w:pPr>
+              <w:tabs>
+                <w:tab w:val="left" w:pos="2680"/>
+              </w:tabs>
+              <w:rPr>
+                <w:rFonts w:ascii="KaiTi" w:eastAsia="KaiTi" w:hAnsi="KaiTi" w:cs="Arial"/>
+              </w:rPr>
+            </w:pPr>
+            <w:r>
+              <w:rPr>
+                <w:rFonts w:ascii="KaiTi" w:eastAsia="KaiTi" w:hAnsi="KaiTi" w:cs="Arial" w:hint="eastAsia"/>
+                <w:b/>
+                <w:bCs/>
+              </w:rPr>
+              <w:t>孩子姓名</w:t>
+            </w:r>
+            <w:r>
+              <w:rPr>
+                <w:rFonts w:ascii="KaiTi" w:eastAsia="KaiTi" w:hAnsi="KaiTi" w:cs="Arial"/>
+                <w:b/>
+                <w:bCs/>
+              </w:rPr>
+              <w:t xml:space="preserve">: </w:t>
+            </w:r>
+            <w:r>
+              <w:rPr>
+                <w:rFonts w:ascii="KaiTi" w:eastAsia="KaiTi" w:hAnsi="KaiTi" w:cs="Arial"/>
+                <w:highlight w:val="yellow"/>
+              </w:rPr>
+              <w:t>xx</w:t>
+            </w:r>
+          </w:p>
+        </w:tc>
+        <w:tc>
+          <w:tcPr>
+            <w:tcW w:w="4855" w:type="dxa"/>
+          </w:tcPr>
+          <w:p>
+            <w:pPr>
+              <w:tabs>
+                <w:tab w:val="left" w:pos="2680"/>
+              </w:tabs>
+              <w:rPr>
+                <w:rFonts w:ascii="KaiTi" w:eastAsia="KaiTi" w:hAnsi="KaiTi" w:cs="Arial"/>
+              </w:rPr>
+            </w:pPr>
+            <w:r>
+              <w:rPr>
+                <w:rFonts w:ascii="KaiTi" w:eastAsia="KaiTi" w:hAnsi="KaiTi" w:cs="Arial" w:hint="eastAsia"/>
+                <w:b/>
+                <w:bCs/>
+              </w:rPr>
+              <w:t>报告日期</w:t>
+            </w:r>
+            <w:r>
+              <w:rPr>
+                <w:rFonts w:ascii="KaiTi" w:eastAsia="KaiTi" w:hAnsi="KaiTi" w:cs="Arial"/>
+              </w:rPr>
+              <w:t xml:space="preserve">: </w:t>
+            </w:r>
+            <w:r>
+              <w:rPr>
+                <w:rFonts w:ascii="KaiTi" w:eastAsia="KaiTi" w:hAnsi="KaiTi" w:cs="Arial"/>
+                <w:highlight w:val="yellow"/>
+              </w:rPr>
+              <w:t>XX</w:t>
+            </w:r>
+          </w:p>
+        </w:tc>
+      </w:tr>
+      <w:tr>
+        <w:tc>
+          <w:tcPr>
+            <w:tcW w:w="4495" w:type="dxa"/>
+          </w:tcPr>
+          <w:p>
+            <w:pPr>
+              <w:tabs>
+                <w:tab w:val="left" w:pos="2680"/>
+              </w:tabs>
+              <w:rPr>
+                <w:rFonts w:ascii="KaiTi" w:eastAsia="KaiTi" w:hAnsi="KaiTi" w:cs="Arial"/>
+              </w:rPr>
+            </w:pPr>
+            <w:commentRangeStart w:id="0"/>
+            <w:r>
+              <w:rPr>
+                <w:rFonts w:ascii="KaiTi" w:eastAsia="KaiTi" w:hAnsi="KaiTi" w:cs="Arial" w:hint="eastAsia"/>
+                <w:b/>
+                <w:bCs/>
+              </w:rPr>
+              <w:t>性别</w:t>
+            </w:r>
+            <w:commentRangeEnd w:id="0"/>
+            <w:r>
+              <w:rPr>
+                <w:rStyle w:val="CommentReference"/>
+                <w:rFonts w:ascii="KaiTi" w:eastAsia="KaiTi" w:hAnsi="KaiTi" w:cs="Arial"/>
+                <w:b/>
+                <w:bCs/>
+                <w:sz w:val="24"/>
+                <w:szCs w:val="24"/>
+              </w:rPr>
+              <w:commentReference w:id="0"/>
+            </w:r>
+            <w:r>
+              <w:rPr>
+                <w:rFonts w:ascii="KaiTi" w:eastAsia="KaiTi" w:hAnsi="KaiTi" w:cs="Arial"/>
+                <w:b/>
+                <w:bCs/>
+              </w:rPr>
+              <w:t>:</w:t>
+            </w:r>
+            <w:r>
+              <w:rPr>
+                <w:rFonts w:ascii="KaiTi" w:eastAsia="KaiTi" w:hAnsi="KaiTi" w:cs="Arial"/>
+              </w:rPr>
+              <w:t xml:space="preserve"> </w:t>
+            </w:r>
+            <w:r>
+              <w:rPr>
+                <w:rFonts w:ascii="KaiTi" w:eastAsia="KaiTi" w:hAnsi="KaiTi" w:cs="Arial"/>
+                <w:highlight w:val="yellow"/>
+              </w:rPr>
+              <w:t>xx</w:t>
+            </w:r>
+          </w:p>
+        </w:tc>
+        <w:tc>
+          <w:tcPr>
+            <w:tcW w:w="4855" w:type="dxa"/>
+          </w:tcPr>
+          <w:p>
+            <w:pPr>
+              <w:tabs>
+                <w:tab w:val="left" w:pos="2680"/>
+              </w:tabs>
+              <w:rPr>
+                <w:rFonts w:ascii="KaiTi" w:eastAsia="KaiTi" w:hAnsi="KaiTi" w:cs="Arial"/>
+              </w:rPr>
+            </w:pPr>
+            <w:r>
+              <w:rPr>
+                <w:rFonts w:ascii="KaiTi" w:eastAsia="KaiTi" w:hAnsi="KaiTi" w:cs="Arial" w:hint="eastAsia"/>
+                <w:b/>
+                <w:bCs/>
+              </w:rPr>
+              <w:t>测试日期</w:t>
+            </w:r>
+            <w:r>
+              <w:rPr>
+                <w:rFonts w:ascii="KaiTi" w:eastAsia="KaiTi" w:hAnsi="KaiTi" w:cs="Arial"/>
+              </w:rPr>
+              <w:t xml:space="preserve">: </w:t>
+            </w:r>
+            <w:r>
+              <w:rPr>
+                <w:rFonts w:ascii="KaiTi" w:eastAsia="KaiTi" w:hAnsi="KaiTi" w:cs="Arial"/>
+                <w:highlight w:val="yellow"/>
+              </w:rPr>
+              <w:t>XX</w:t>
+            </w:r>
+          </w:p>
+        </w:tc>
+      </w:tr>
+      <w:tr>
+        <w:tc>
+          <w:tcPr>
+            <w:tcW w:w="4495" w:type="dxa"/>
+          </w:tcPr>
+          <w:p>
+            <w:pPr>
+              <w:tabs>
+                <w:tab w:val="left" w:pos="2680"/>
+              </w:tabs>
+              <w:rPr>
+                <w:rFonts w:ascii="KaiTi" w:eastAsia="KaiTi" w:hAnsi="KaiTi" w:cs="Arial"/>
+              </w:rPr>
+            </w:pPr>
+          </w:p>
+        </w:tc>
+        <w:tc>
+          <w:tcPr>
+            <w:tcW w:w="4855" w:type="dxa"/>
+          </w:tcPr>
+          <w:p>
+            <w:pPr>
+              <w:tabs>
+                <w:tab w:val="left" w:pos="2680"/>
+              </w:tabs>
+              <w:rPr>
+                <w:rFonts w:ascii="KaiTi" w:eastAsia="KaiTi" w:hAnsi="KaiTi" w:cs="Arial"/>
+              </w:rPr>
+            </w:pPr>
+            <w:r>
+              <w:rPr>
+                <w:rFonts w:ascii="KaiTi" w:eastAsia="KaiTi" w:hAnsi="KaiTi" w:cs="Arial" w:hint="eastAsia"/>
+                <w:b/>
+                <w:bCs/>
+              </w:rPr>
+              <w:t>出生日期</w:t>
+            </w:r>
+            <w:r>
+              <w:rPr>
+                <w:rFonts w:ascii="KaiTi" w:eastAsia="KaiTi" w:hAnsi="KaiTi" w:cs="Arial"/>
+              </w:rPr>
+              <w:t xml:space="preserve">: </w:t>
+            </w:r>
+            <w:r>
+              <w:rPr>
+                <w:rFonts w:ascii="KaiTi" w:eastAsia="KaiTi" w:hAnsi="KaiTi" w:cs="Arial"/>
+                <w:highlight w:val="yellow"/>
+              </w:rPr>
+              <w:t>XX</w:t>
+            </w:r>
+          </w:p>
+        </w:tc>
+      </w:tr>
+      <w:tr>
+        <w:tc>
+          <w:tcPr>
+            <w:tcW w:w="4495" w:type="dxa"/>
+          </w:tcPr>
+          <w:p>
+            <w:pPr>
+              <w:tabs>
+                <w:tab w:val="left" w:pos="2680"/>
+              </w:tabs>
+              <w:rPr>
+                <w:rFonts w:ascii="KaiTi" w:eastAsia="KaiTi" w:hAnsi="KaiTi" w:cs="Arial"/>
+              </w:rPr>
+            </w:pPr>
+          </w:p>
+        </w:tc>
+        <w:tc>
+          <w:tcPr>
+            <w:tcW w:w="4855" w:type="dxa"/>
+          </w:tcPr>
+          <w:p>
+            <w:pPr>
+              <w:tabs>
+                <w:tab w:val="left" w:pos="2680"/>
+              </w:tabs>
+              <w:rPr>
+                <w:rFonts w:ascii="KaiTi" w:eastAsia="KaiTi" w:hAnsi="KaiTi" w:cs="Arial"/>
+              </w:rPr>
+            </w:pPr>
+            <w:r>
+              <w:rPr>
+                <w:rFonts w:ascii="KaiTi" w:eastAsia="KaiTi" w:hAnsi="KaiTi" w:cs="Arial" w:hint="eastAsia"/>
+                <w:b/>
+                <w:bCs/>
+              </w:rPr>
+              <w:t>月龄</w:t>
+            </w:r>
+            <w:r>
+              <w:rPr>
+                <w:rFonts w:ascii="KaiTi" w:eastAsia="KaiTi" w:hAnsi="KaiTi" w:cs="Arial"/>
+              </w:rPr>
+              <w:t xml:space="preserve">: </w:t>
+            </w:r>
+            <w:r>
+              <w:rPr>
+                <w:rFonts w:ascii="KaiTi" w:eastAsia="KaiTi" w:hAnsi="KaiTi" w:cs="Arial"/>
+                <w:highlight w:val="yellow"/>
+              </w:rPr>
+              <w:t>xx</w:t>
+            </w:r>
+          </w:p>
+        </w:tc>
+      </w:tr>
+    </w:tbl>
+    <w:p>
+      <w:pPr>
+        <w:tabs>
+          <w:tab w:val="left" w:pos="2680"/>
+        </w:tabs>
+        <w:rPr>
+          <w:rFonts w:ascii="KaiTi" w:eastAsia="KaiTi" w:hAnsi="KaiTi" w:cs="Arial"/>
+        </w:rPr>
+      </w:pPr>
+    </w:p>
+    <w:tbl>
+      <w:tblPr>
+        <w:tblStyle w:val="TableGrid"/>
+        <w:tblW w:w="0" w:type="auto"/>
+        <w:tblLook w:val="04A0" w:firstRow="1" w:lastRow="0" w:firstColumn="1" w:lastColumn="0" w:noHBand="0" w:noVBand="1"/>
+      </w:tblPr>
+      <w:tblGrid>
+        <w:gridCol w:w="9350"/>
+      </w:tblGrid>
+      <w:tr>
+        <w:tc>
+          <w:tcPr>
+            <w:tcW w:w="9350" w:type="dxa"/>
+          </w:tcPr>
+          <w:p>
+            <w:pPr>
+              <w:tabs>
+                <w:tab w:val="left" w:pos="2680"/>
+              </w:tabs>
+              <w:rPr>
+                <w:rFonts w:ascii="KaiTi" w:eastAsia="KaiTi" w:hAnsi="KaiTi" w:cs="Arial"/>
+                <w:b/>
+                <w:bCs/>
+              </w:rPr>
+            </w:pPr>
+            <w:r>
+              <w:rPr>
+                <w:rFonts w:ascii="KaiTi" w:eastAsia="KaiTi" w:hAnsi="KaiTi" w:cs="Arial" w:hint="eastAsia"/>
+                <w:b/>
+                <w:bCs/>
+              </w:rPr>
+              <w:t>英文词汇量</w:t>
+            </w:r>
+          </w:p>
+          <w:p>
+            <w:pPr>
+              <w:tabs>
+                <w:tab w:val="left" w:pos="2680"/>
+              </w:tabs>
+              <w:ind w:left="720"/>
+              <w:rPr>
+                <w:rFonts w:ascii="KaiTi" w:eastAsia="KaiTi" w:hAnsi="KaiTi" w:cs="Arial"/>
+              </w:rPr>
+            </w:pPr>
+            <w:r>
+              <w:rPr>
+                <w:rFonts w:ascii="KaiTi" w:eastAsia="KaiTi" w:hAnsi="KaiTi" w:cs="Arial" w:hint="eastAsia"/>
+              </w:rPr>
+              <w:t>理解与表达总词汇量</w:t>
+            </w:r>
+            <w:r>
+              <w:rPr>
+                <w:rFonts w:ascii="KaiTi" w:eastAsia="KaiTi" w:hAnsi="KaiTi" w:cs="Arial"/>
+              </w:rPr>
+              <w:t xml:space="preserve">: </w:t>
+            </w:r>
+            <w:r>
+              <w:rPr>
+                <w:rFonts w:ascii="KaiTi" w:eastAsia="KaiTi" w:hAnsi="KaiTi" w:cs="Arial" w:hint="eastAsia"/>
+                <w:highlight w:val="yellow"/>
+              </w:rPr>
+              <w:t>ENTER</w:t>
+            </w:r>
+            <w:r>
+              <w:rPr>
+                <w:rFonts w:ascii="KaiTi" w:eastAsia="KaiTi" w:hAnsi="KaiTi" w:cs="Arial"/>
+                <w:highlight w:val="yellow"/>
+              </w:rPr>
+              <w:t>number</w:t>
+            </w:r>
+            <w:r>
+              <w:rPr>
+                <w:rFonts w:ascii="KaiTi" w:eastAsia="KaiTi" w:hAnsi="KaiTi" w:cs="Arial" w:hint="eastAsia"/>
+              </w:rPr>
+              <w:t xml:space="preserve"> (共</w:t>
+            </w:r>
+            <w:r>
+              <w:rPr>
+                <w:rFonts w:ascii="KaiTi" w:eastAsia="KaiTi" w:hAnsi="KaiTi" w:cs="Arial"/>
+              </w:rPr>
+              <w:t>680</w:t>
+            </w:r>
+            <w:r>
+              <w:rPr>
+                <w:rFonts w:ascii="KaiTi" w:eastAsia="KaiTi" w:hAnsi="KaiTi" w:cs="Arial" w:hint="eastAsia"/>
+              </w:rPr>
+              <w:t>个词</w:t>
+            </w:r>
+            <w:r>
+              <w:rPr>
+                <w:rFonts w:ascii="KaiTi" w:eastAsia="KaiTi" w:hAnsi="KaiTi" w:cs="Arial"/>
+              </w:rPr>
+              <w:t>)</w:t>
+            </w:r>
+          </w:p>
+          <w:p>
+            <w:pPr>
+              <w:tabs>
+                <w:tab w:val="left" w:pos="2680"/>
+              </w:tabs>
+              <w:rPr>
+                <w:rFonts w:ascii="KaiTi" w:eastAsia="KaiTi" w:hAnsi="KaiTi" w:cs="Arial"/>
+              </w:rPr>
+            </w:pPr>
+          </w:p>
+          <w:p>
+            <w:pPr>
+              <w:tabs>
+                <w:tab w:val="left" w:pos="2680"/>
+              </w:tabs>
+              <w:rPr>
+                <w:rFonts w:ascii="KaiTi" w:eastAsia="KaiTi" w:hAnsi="KaiTi" w:cs="Arial"/>
+                <w:b/>
+                <w:bCs/>
+              </w:rPr>
+            </w:pPr>
+            <w:r>
+              <w:rPr>
+                <w:rFonts w:ascii="KaiTi" w:eastAsia="KaiTi" w:hAnsi="KaiTi" w:cs="Arial" w:hint="eastAsia"/>
+                <w:b/>
+                <w:bCs/>
+              </w:rPr>
+              <w:t>中文词汇量</w:t>
+            </w:r>
+          </w:p>
+          <w:p>
+            <w:pPr>
+              <w:tabs>
+                <w:tab w:val="left" w:pos="2680"/>
+              </w:tabs>
+              <w:ind w:left="720"/>
+              <w:rPr>
+                <w:rFonts w:ascii="KaiTi" w:eastAsia="KaiTi" w:hAnsi="KaiTi" w:cs="Arial"/>
+              </w:rPr>
+            </w:pPr>
+            <w:r>
+              <w:rPr>
+                <w:rFonts w:ascii="KaiTi" w:eastAsia="KaiTi" w:hAnsi="KaiTi" w:cs="Arial" w:hint="eastAsia"/>
+              </w:rPr>
+              <w:t>理解与表达总词汇量</w:t>
+            </w:r>
+            <w:r>
+              <w:rPr>
+                <w:rFonts w:ascii="KaiTi" w:eastAsia="KaiTi" w:hAnsi="KaiTi" w:cs="Arial"/>
+              </w:rPr>
+              <w:t xml:space="preserve">: </w:t>
+            </w:r>
+            <w:r>
+              <w:rPr>
+                <w:rFonts w:ascii="KaiTi" w:eastAsia="KaiTi" w:hAnsi="KaiTi" w:cs="Arial" w:hint="eastAsia"/>
+                <w:highlight w:val="yellow"/>
+              </w:rPr>
+              <w:t>ENTER</w:t>
+            </w:r>
+            <w:r>
+              <w:rPr>
+                <w:rFonts w:ascii="KaiTi" w:eastAsia="KaiTi" w:hAnsi="KaiTi" w:cs="Arial"/>
+                <w:highlight w:val="yellow"/>
+              </w:rPr>
+              <w:t>number</w:t>
+            </w:r>
+            <w:r>
+              <w:rPr>
+                <w:rFonts w:ascii="KaiTi" w:eastAsia="KaiTi" w:hAnsi="KaiTi" w:cs="Arial"/>
+              </w:rPr>
+              <w:t xml:space="preserve"> (</w:t>
+            </w:r>
+            <w:r>
+              <w:rPr>
+                <w:rFonts w:ascii="KaiTi" w:eastAsia="KaiTi" w:hAnsi="KaiTi" w:cs="Arial" w:hint="eastAsia"/>
+              </w:rPr>
+              <w:t>共799个词</w:t>
+            </w:r>
+            <w:r>
+              <w:rPr>
+                <w:rFonts w:ascii="KaiTi" w:eastAsia="KaiTi" w:hAnsi="KaiTi" w:cs="Arial"/>
+              </w:rPr>
+              <w:t>)</w:t>
+            </w:r>
+          </w:p>
+          <w:p>
+            <w:pPr>
+              <w:tabs>
+                <w:tab w:val="left" w:pos="2680"/>
+              </w:tabs>
+              <w:ind w:left="720"/>
+              <w:rPr>
+                <w:rFonts w:ascii="KaiTi" w:eastAsia="KaiTi" w:hAnsi="KaiTi" w:cs="Arial"/>
+              </w:rPr>
+            </w:pPr>
+          </w:p>
+          <w:p>
+            <w:pPr>
+              <w:tabs>
+                <w:tab w:val="left" w:pos="2680"/>
+              </w:tabs>
+              <w:rPr>
+                <w:rFonts w:ascii="KaiTi" w:eastAsia="KaiTi" w:hAnsi="KaiTi" w:cs="Arial"/>
+              </w:rPr>
+            </w:pPr>
+            <w:r>
+              <w:rPr>
+                <w:rFonts w:ascii="KaiTi" w:eastAsia="KaiTi" w:hAnsi="KaiTi" w:cs="Arial" w:hint="eastAsia"/>
+                <w:b/>
+                <w:bCs/>
+              </w:rPr>
+              <w:t>中英文词汇总数</w:t>
+            </w:r>
+          </w:p>
+          <w:p>
+            <w:pPr>
+              <w:tabs>
+                <w:tab w:val="left" w:pos="2680"/>
+              </w:tabs>
+              <w:ind w:left="720"/>
+              <w:rPr>
+                <w:rFonts w:ascii="KaiTi" w:eastAsia="KaiTi" w:hAnsi="KaiTi" w:cs="Arial"/>
+              </w:rPr>
+            </w:pPr>
+            <w:r>
+              <w:rPr>
+                <w:rFonts w:ascii="KaiTi" w:eastAsia="KaiTi" w:hAnsi="KaiTi" w:cs="Arial" w:hint="eastAsia"/>
+              </w:rPr>
+              <w:t>理解与表达总词汇量</w:t>
+            </w:r>
+            <w:r>
+              <w:rPr>
+                <w:rFonts w:ascii="KaiTi" w:eastAsia="KaiTi" w:hAnsi="KaiTi" w:cs="Arial"/>
+              </w:rPr>
+              <w:t xml:space="preserve">: </w:t>
+            </w:r>
+            <w:r>
+              <w:rPr>
+                <w:rFonts w:ascii="KaiTi" w:eastAsia="KaiTi" w:hAnsi="KaiTi" w:cs="Arial" w:hint="eastAsia"/>
+                <w:highlight w:val="yellow"/>
+              </w:rPr>
+              <w:t>ENTER</w:t>
+            </w:r>
+            <w:r>
+              <w:rPr>
+                <w:rFonts w:ascii="KaiTi" w:eastAsia="KaiTi" w:hAnsi="KaiTi" w:cs="Arial"/>
+                <w:highlight w:val="yellow"/>
+              </w:rPr>
+              <w:t>number</w:t>
+            </w:r>
+          </w:p>
+          <w:p>
+            <w:pPr>
+              <w:tabs>
+                <w:tab w:val="left" w:pos="2680"/>
+              </w:tabs>
+              <w:ind w:left="720"/>
+              <w:rPr>
+                <w:rFonts w:ascii="KaiTi" w:eastAsia="KaiTi" w:hAnsi="KaiTi" w:cs="Arial"/>
+              </w:rPr>
+            </w:pPr>
+          </w:p>
+          <w:p>
+            <w:pPr>
+              <w:tabs>
+                <w:tab w:val="left" w:pos="2680"/>
+              </w:tabs>
+              <w:rPr>
+                <w:rFonts w:ascii="KaiTi" w:eastAsia="KaiTi" w:hAnsi="KaiTi" w:cs="Arial"/>
+              </w:rPr>
+            </w:pPr>
+            <w:r>
+              <w:rPr>
+                <w:rFonts w:ascii="KaiTi" w:eastAsia="KaiTi" w:hAnsi="KaiTi" w:cs="Arial" w:hint="eastAsia"/>
+                <w:b/>
+                <w:bCs/>
+              </w:rPr>
+              <w:t>百分位数</w:t>
+            </w:r>
+          </w:p>
+          <w:p>
+            <w:pPr>
+              <w:tabs>
+                <w:tab w:val="left" w:pos="2680"/>
+              </w:tabs>
+              <w:ind w:left="720"/>
+              <w:rPr>
+                <w:rFonts w:ascii="KaiTi" w:eastAsia="KaiTi" w:hAnsi="KaiTi" w:cs="Arial"/>
+              </w:rPr>
+            </w:pPr>
+            <w:r>
+              <w:rPr>
+                <w:rFonts w:ascii="KaiTi" w:eastAsia="KaiTi" w:hAnsi="KaiTi" w:cs="Arial" w:hint="eastAsia"/>
+              </w:rPr>
+              <w:t>理解与表达总词汇量</w:t>
+            </w:r>
+            <w:r>
+              <w:rPr>
+                <w:rFonts w:ascii="KaiTi" w:eastAsia="KaiTi" w:hAnsi="KaiTi" w:cs="Arial" w:hint="eastAsia"/>
+              </w:rPr>
+              <w:t>（根据同龄、同性别、能表达的词汇常模对比得出）</w:t>
+            </w:r>
+            <w:r>
+              <w:rPr>
+                <w:rFonts w:ascii="KaiTi" w:eastAsia="KaiTi" w:hAnsi="KaiTi" w:cs="Arial" w:hint="eastAsia"/>
+                <w:highlight w:val="yellow"/>
+              </w:rPr>
+              <w:t>ENTER</w:t>
+            </w:r>
+            <w:r>
+              <w:rPr>
+                <w:rFonts w:ascii="KaiTi" w:eastAsia="KaiTi" w:hAnsi="KaiTi" w:cs="Arial"/>
+                <w:highlight w:val="yellow"/>
+              </w:rPr>
+              <w:t>number</w:t>
+            </w:r>
+            <w:r>
+              <w:rPr>
+                <w:rFonts w:ascii="KaiTi" w:eastAsia="KaiTi" w:hAnsi="KaiTi" w:cs="Arial"/>
+              </w:rPr>
+              <w:t>%</w:t>
+            </w:r>
+          </w:p>
+          <w:p>
+            <w:pPr>
+              <w:tabs>
+                <w:tab w:val="left" w:pos="2680"/>
+              </w:tabs>
+              <w:rPr>
+                <w:rFonts w:ascii="KaiTi" w:eastAsia="KaiTi" w:hAnsi="KaiTi" w:cs="Arial"/>
+              </w:rPr>
+            </w:pPr>
+          </w:p>
+          <w:p>
+            <w:pPr>
+              <w:tabs>
+                <w:tab w:val="left" w:pos="2680"/>
+              </w:tabs>
+              <w:rPr>
+                <w:rFonts w:ascii="KaiTi" w:eastAsia="KaiTi" w:hAnsi="KaiTi" w:cs="Arial"/>
+              </w:rPr>
+            </w:pPr>
+          </w:p>
+        </w:tc>
+      </w:tr>
+    </w:tbl>
+    <w:p>
+      <w:pPr>
+        <w:tabs>
+          <w:tab w:val="left" w:pos="2680"/>
+        </w:tabs>
+        <w:rPr>
+          <w:rFonts w:cs="Times New Roman"/>
+        </w:rPr>
+      </w:pPr>
+    </w:p>
+    <w:p>
+      <w:pPr>
+        <w:tabs>
+          <w:tab w:val="left" w:pos="2680"/>
+        </w:tabs>
+        <w:rPr>
+          <w:rFonts w:cs="Times New Roman"/>
+        </w:rPr>
+      </w:pPr>
+    </w:p>
+    <w:p>
+      <w:pPr>
+        <w:tabs>
+          <w:tab w:val="left" w:pos="2680"/>
+        </w:tabs>
+      </w:pPr>
+    </w:p>
+    <w:p>
+      <w:pPr>
+        <w:tabs>
+          <w:tab w:val="left" w:pos="2680"/>
+        </w:tabs>
+      </w:pPr>
+    </w:p>
     <w:sectPr>
-      <w:headerReference w:type="default" r:id="rId15"/>
-      <w:footerReference w:type="default" r:id="rId16"/>
+      <w:headerReference w:type="default" r:id="rId19"/>
+      <w:footerReference w:type="default" r:id="rId20"/>
       <w:pgSz w:w="12240" w:h="15840"/>
       <w:pgMar w:top="1440" w:right="1440" w:bottom="1440" w:left="1440" w:header="720" w:footer="720" w:gutter="0"/>
       <w:cols w:space="720"/>
@@ -1952,6 +3735,65 @@
     </w:sectPr>
   </w:body>
 </w:document>
+</file>
+
+<file path=word/comments.xml><?xml version="1.0" encoding="utf-8"?>
+<w:comments xmlns:wpc="http://schemas.microsoft.com/office/word/2010/wordprocessingCanvas" xmlns:cx="http://schemas.microsoft.com/office/drawing/2014/chartex" xmlns:cx1="http://schemas.microsoft.com/office/drawing/2015/9/8/chartex" xmlns:cx2="http://schemas.microsoft.com/office/drawing/2015/10/21/chartex" xmlns:cx3="http://schemas.microsoft.com/office/drawing/2016/5/9/chartex" xmlns:cx4="http://schemas.microsoft.com/office/drawing/2016/5/10/chartex" xmlns:cx5="http://schemas.microsoft.com/office/drawing/2016/5/11/chartex" xmlns:cx6="http://schemas.microsoft.com/office/drawing/2016/5/12/chartex" xmlns:cx7="http://schemas.microsoft.com/office/drawing/2016/5/13/chartex" xmlns:cx8="http://schemas.microsoft.com/office/drawing/2016/5/14/chartex" xmlns:mc="http://schemas.openxmlformats.org/markup-compatibility/2006" xmlns:aink="http://schemas.microsoft.com/office/drawing/2016/ink" xmlns:am3d="http://schemas.microsoft.com/office/drawing/2017/model3d" xmlns:o="urn:schemas-microsoft-com:office:office" xmlns:oel="http://schemas.microsoft.com/office/2019/extlst" xmlns:r="http://schemas.openxmlformats.org/officeDocument/2006/relationships" xmlns:m="http://schemas.openxmlformats.org/officeDocument/2006/math" xmlns:v="urn:schemas-microsoft-com:vml" xmlns:wp14="http://schemas.microsoft.com/office/word/2010/wordprocessingDrawing" xmlns:wp="http://schemas.openxmlformats.org/drawingml/2006/wordprocessingDrawing" xmlns:w10="urn:schemas-microsoft-com:office:word" xmlns:w="http://schemas.openxmlformats.org/wordprocessingml/2006/main" xmlns:w14="http://schemas.microsoft.com/office/word/2010/wordml" xmlns:w15="http://schemas.microsoft.com/office/word/2012/wordml" xmlns:w16cex="http://schemas.microsoft.com/office/word/2018/wordml/cex" xmlns:w16cid="http://schemas.microsoft.com/office/word/2016/wordml/cid" xmlns:w16="http://schemas.microsoft.com/office/word/2018/wordml" xmlns:w16du="http://schemas.microsoft.com/office/word/2023/wordml/word16du" xmlns:w16sdtdh="http://schemas.microsoft.com/office/word/2020/wordml/sdtdatahash" xmlns:w16sdtfl="http://schemas.microsoft.com/office/word/2024/wordml/sdtformatlock" xmlns:w16se="http://schemas.microsoft.com/office/word/2015/wordml/symex" xmlns:wpg="http://schemas.microsoft.com/office/word/2010/wordprocessingGroup" xmlns:wpi="http://schemas.microsoft.com/office/word/2010/wordprocessingInk" xmlns:wne="http://schemas.microsoft.com/office/word/2006/wordml" xmlns:wps="http://schemas.microsoft.com/office/word/2010/wordprocessingShape" mc:Ignorable="w14 w15 w16se w16cid w16 w16cex w16sdtdh w16sdtfl w16du wp14">
+  <w:comment w:id="0" w:author="Xu, Jingyi" w:date="2026-04-13T11:47:00Z" w:initials="JX">
+    <w:p>
+      <w:pPr>
+        <w:pStyle w:val="CommentText"/>
+      </w:pPr>
+      <w:r>
+        <w:rPr>
+          <w:rStyle w:val="CommentReference"/>
+        </w:rPr>
+        <w:annotationRef/>
+      </w:r>
+      <w:r>
+        <w:t xml:space="preserve">Boy: </w:t>
+      </w:r>
+      <w:r>
+        <w:rPr>
+          <w:rFonts w:hint="eastAsia"/>
+        </w:rPr>
+        <w:t>男</w:t>
+      </w:r>
+    </w:p>
+    <w:p>
+      <w:pPr>
+        <w:pStyle w:val="CommentText"/>
+      </w:pPr>
+      <w:r>
+        <w:t xml:space="preserve">Girl: </w:t>
+      </w:r>
+      <w:r>
+        <w:rPr>
+          <w:rFonts w:hint="eastAsia"/>
+        </w:rPr>
+        <w:t>女</w:t>
+      </w:r>
+    </w:p>
+  </w:comment>
+</w:comments>
+</file>
+
+<file path=word/commentsExtended.xml><?xml version="1.0" encoding="utf-8"?>
+<w15:commentsEx xmlns:wpc="http://schemas.microsoft.com/office/word/2010/wordprocessingCanvas" xmlns:cx="http://schemas.microsoft.com/office/drawing/2014/chartex" xmlns:cx1="http://schemas.microsoft.com/office/drawing/2015/9/8/chartex" xmlns:cx2="http://schemas.microsoft.com/office/drawing/2015/10/21/chartex" xmlns:cx3="http://schemas.microsoft.com/office/drawing/2016/5/9/chartex" xmlns:cx4="http://schemas.microsoft.com/office/drawing/2016/5/10/chartex" xmlns:cx5="http://schemas.microsoft.com/office/drawing/2016/5/11/chartex" xmlns:cx6="http://schemas.microsoft.com/office/drawing/2016/5/12/chartex" xmlns:cx7="http://schemas.microsoft.com/office/drawing/2016/5/13/chartex" xmlns:cx8="http://schemas.microsoft.com/office/drawing/2016/5/14/chartex" xmlns:mc="http://schemas.openxmlformats.org/markup-compatibility/2006" xmlns:aink="http://schemas.microsoft.com/office/drawing/2016/ink" xmlns:am3d="http://schemas.microsoft.com/office/drawing/2017/model3d" xmlns:o="urn:schemas-microsoft-com:office:office" xmlns:oel="http://schemas.microsoft.com/office/2019/extlst" xmlns:r="http://schemas.openxmlformats.org/officeDocument/2006/relationships" xmlns:m="http://schemas.openxmlformats.org/officeDocument/2006/math" xmlns:v="urn:schemas-microsoft-com:vml" xmlns:wp14="http://schemas.microsoft.com/office/word/2010/wordprocessingDrawing" xmlns:wp="http://schemas.openxmlformats.org/drawingml/2006/wordprocessingDrawing" xmlns:w10="urn:schemas-microsoft-com:office:word" xmlns:w="http://schemas.openxmlformats.org/wordprocessingml/2006/main" xmlns:w14="http://schemas.microsoft.com/office/word/2010/wordml" xmlns:w15="http://schemas.microsoft.com/office/word/2012/wordml" xmlns:w16cex="http://schemas.microsoft.com/office/word/2018/wordml/cex" xmlns:w16cid="http://schemas.microsoft.com/office/word/2016/wordml/cid" xmlns:w16="http://schemas.microsoft.com/office/word/2018/wordml" xmlns:w16du="http://schemas.microsoft.com/office/word/2023/wordml/word16du" xmlns:w16sdtdh="http://schemas.microsoft.com/office/word/2020/wordml/sdtdatahash" xmlns:w16sdtfl="http://schemas.microsoft.com/office/word/2024/wordml/sdtformatlock" xmlns:w16se="http://schemas.microsoft.com/office/word/2015/wordml/symex" xmlns:wpg="http://schemas.microsoft.com/office/word/2010/wordprocessingGroup" xmlns:wpi="http://schemas.microsoft.com/office/word/2010/wordprocessingInk" xmlns:wne="http://schemas.microsoft.com/office/word/2006/wordml" xmlns:wps="http://schemas.microsoft.com/office/word/2010/wordprocessingShape" mc:Ignorable="w14 w15 w16se w16cid w16 w16cex w16sdtdh w16sdtfl w16du wp14">
+  <w15:commentEx w15:paraId="6ACF8584" w15:done="0"/>
+</w15:commentsEx>
+</file>
+
+<file path=word/commentsExtensible.xml><?xml version="1.0" encoding="utf-8"?>
+<w16cex:commentsExtensible xmlns:wpc="http://schemas.microsoft.com/office/word/2010/wordprocessingCanvas" xmlns:cx="http://schemas.microsoft.com/office/drawing/2014/chartex" xmlns:cx1="http://schemas.microsoft.com/office/drawing/2015/9/8/chartex" xmlns:cx2="http://schemas.microsoft.com/office/drawing/2015/10/21/chartex" xmlns:cx3="http://schemas.microsoft.com/office/drawing/2016/5/9/chartex" xmlns:cx4="http://schemas.microsoft.com/office/drawing/2016/5/10/chartex" xmlns:cx5="http://schemas.microsoft.com/office/drawing/2016/5/11/chartex" xmlns:cx6="http://schemas.microsoft.com/office/drawing/2016/5/12/chartex" xmlns:cx7="http://schemas.microsoft.com/office/drawing/2016/5/13/chartex" xmlns:cx8="http://schemas.microsoft.com/office/drawing/2016/5/14/chartex" xmlns:cr="http://schemas.microsoft.com/office/comments/2020/reactions" xmlns:mc="http://schemas.openxmlformats.org/markup-compatibility/2006" xmlns:aink="http://schemas.microsoft.com/office/drawing/2016/ink" xmlns:am3d="http://schemas.microsoft.com/office/drawing/2017/model3d" xmlns:o="urn:schemas-microsoft-com:office:office" xmlns:oel="http://schemas.microsoft.com/office/2019/extlst" xmlns:r="http://schemas.openxmlformats.org/officeDocument/2006/relationships" xmlns:m="http://schemas.openxmlformats.org/officeDocument/2006/math" xmlns:v="urn:schemas-microsoft-com:vml" xmlns:wp14="http://schemas.microsoft.com/office/word/2010/wordprocessingDrawing" xmlns:wp="http://schemas.openxmlformats.org/drawingml/2006/wordprocessingDrawing" xmlns:w10="urn:schemas-microsoft-com:office:word" xmlns:w="http://schemas.openxmlformats.org/wordprocessingml/2006/main" xmlns:w14="http://schemas.microsoft.com/office/word/2010/wordml" xmlns:w15="http://schemas.microsoft.com/office/word/2012/wordml" xmlns:w16cex="http://schemas.microsoft.com/office/word/2018/wordml/cex" xmlns:w16cid="http://schemas.microsoft.com/office/word/2016/wordml/cid" xmlns:w16="http://schemas.microsoft.com/office/word/2018/wordml" xmlns:w16du="http://schemas.microsoft.com/office/word/2023/wordml/word16du" xmlns:w16sdtdh="http://schemas.microsoft.com/office/word/2020/wordml/sdtdatahash" xmlns:w16sdtfl="http://schemas.microsoft.com/office/word/2024/wordml/sdtformatlock" xmlns:w16se="http://schemas.microsoft.com/office/word/2015/wordml/symex" xmlns:wpg="http://schemas.microsoft.com/office/word/2010/wordprocessingGroup" xmlns:wpi="http://schemas.microsoft.com/office/word/2010/wordprocessingInk" xmlns:wne="http://schemas.microsoft.com/office/word/2006/wordml" xmlns:wps="http://schemas.microsoft.com/office/word/2010/wordprocessingShape" mc:Ignorable="w14 w15 w16se w16cid w16 w16cex w16sdtdh w16sdtfl cr w16du wp14">
+  <w16cex:commentExtensible w16cex:durableId="4DCB12D2" w16cex:dateUtc="2026-04-13T16:47:00Z"/>
+</w16cex:commentsExtensible>
+</file>
+
+<file path=word/commentsIds.xml><?xml version="1.0" encoding="utf-8"?>
+<w16cid:commentsIds xmlns:wpc="http://schemas.microsoft.com/office/word/2010/wordprocessingCanvas" xmlns:cx="http://schemas.microsoft.com/office/drawing/2014/chartex" xmlns:cx1="http://schemas.microsoft.com/office/drawing/2015/9/8/chartex" xmlns:cx2="http://schemas.microsoft.com/office/drawing/2015/10/21/chartex" xmlns:cx3="http://schemas.microsoft.com/office/drawing/2016/5/9/chartex" xmlns:cx4="http://schemas.microsoft.com/office/drawing/2016/5/10/chartex" xmlns:cx5="http://schemas.microsoft.com/office/drawing/2016/5/11/chartex" xmlns:cx6="http://schemas.microsoft.com/office/drawing/2016/5/12/chartex" xmlns:cx7="http://schemas.microsoft.com/office/drawing/2016/5/13/chartex" xmlns:cx8="http://schemas.microsoft.com/office/drawing/2016/5/14/chartex" xmlns:mc="http://schemas.openxmlformats.org/markup-compatibility/2006" xmlns:aink="http://schemas.microsoft.com/office/drawing/2016/ink" xmlns:am3d="http://schemas.microsoft.com/office/drawing/2017/model3d" xmlns:o="urn:schemas-microsoft-com:office:office" xmlns:oel="http://schemas.microsoft.com/office/2019/extlst" xmlns:r="http://schemas.openxmlformats.org/officeDocument/2006/relationships" xmlns:m="http://schemas.openxmlformats.org/officeDocument/2006/math" xmlns:v="urn:schemas-microsoft-com:vml" xmlns:wp14="http://schemas.microsoft.com/office/word/2010/wordprocessingDrawing" xmlns:wp="http://schemas.openxmlformats.org/drawingml/2006/wordprocessingDrawing" xmlns:w10="urn:schemas-microsoft-com:office:word" xmlns:w="http://schemas.openxmlformats.org/wordprocessingml/2006/main" xmlns:w14="http://schemas.microsoft.com/office/word/2010/wordml" xmlns:w15="http://schemas.microsoft.com/office/word/2012/wordml" xmlns:w16cex="http://schemas.microsoft.com/office/word/2018/wordml/cex" xmlns:w16cid="http://schemas.microsoft.com/office/word/2016/wordml/cid" xmlns:w16="http://schemas.microsoft.com/office/word/2018/wordml" xmlns:w16du="http://schemas.microsoft.com/office/word/2023/wordml/word16du" xmlns:w16sdtdh="http://schemas.microsoft.com/office/word/2020/wordml/sdtdatahash" xmlns:w16sdtfl="http://schemas.microsoft.com/office/word/2024/wordml/sdtformatlock" xmlns:w16se="http://schemas.microsoft.com/office/word/2015/wordml/symex" xmlns:wpg="http://schemas.microsoft.com/office/word/2010/wordprocessingGroup" xmlns:wpi="http://schemas.microsoft.com/office/word/2010/wordprocessingInk" xmlns:wne="http://schemas.microsoft.com/office/word/2006/wordml" xmlns:wps="http://schemas.microsoft.com/office/word/2010/wordprocessingShape" mc:Ignorable="w14 w15 w16se w16cid w16 w16cex w16sdtdh w16sdtfl w16du wp14">
+  <w16cid:commentId w16cid:paraId="6ACF8584" w16cid:durableId="4DCB12D2"/>
+</w16cid:commentsIds>
 </file>
 
 <file path=word/endnotes.xml><?xml version="1.0" encoding="utf-8"?>
@@ -2834,6 +4676,14 @@
     <w:abstractNumId w:val="0"/>
   </w:num>
 </w:numbering>
+</file>
+
+<file path=word/people.xml><?xml version="1.0" encoding="utf-8"?>
+<w15:people xmlns:wpc="http://schemas.microsoft.com/office/word/2010/wordprocessingCanvas" xmlns:cx="http://schemas.microsoft.com/office/drawing/2014/chartex" xmlns:cx1="http://schemas.microsoft.com/office/drawing/2015/9/8/chartex" xmlns:cx2="http://schemas.microsoft.com/office/drawing/2015/10/21/chartex" xmlns:cx3="http://schemas.microsoft.com/office/drawing/2016/5/9/chartex" xmlns:cx4="http://schemas.microsoft.com/office/drawing/2016/5/10/chartex" xmlns:cx5="http://schemas.microsoft.com/office/drawing/2016/5/11/chartex" xmlns:cx6="http://schemas.microsoft.com/office/drawing/2016/5/12/chartex" xmlns:cx7="http://schemas.microsoft.com/office/drawing/2016/5/13/chartex" xmlns:cx8="http://schemas.microsoft.com/office/drawing/2016/5/14/chartex" xmlns:mc="http://schemas.openxmlformats.org/markup-compatibility/2006" xmlns:aink="http://schemas.microsoft.com/office/drawing/2016/ink" xmlns:am3d="http://schemas.microsoft.com/office/drawing/2017/model3d" xmlns:o="urn:schemas-microsoft-com:office:office" xmlns:oel="http://schemas.microsoft.com/office/2019/extlst" xmlns:r="http://schemas.openxmlformats.org/officeDocument/2006/relationships" xmlns:m="http://schemas.openxmlformats.org/officeDocument/2006/math" xmlns:v="urn:schemas-microsoft-com:vml" xmlns:wp14="http://schemas.microsoft.com/office/word/2010/wordprocessingDrawing" xmlns:wp="http://schemas.openxmlformats.org/drawingml/2006/wordprocessingDrawing" xmlns:w10="urn:schemas-microsoft-com:office:word" xmlns:w="http://schemas.openxmlformats.org/wordprocessingml/2006/main" xmlns:w14="http://schemas.microsoft.com/office/word/2010/wordml" xmlns:w15="http://schemas.microsoft.com/office/word/2012/wordml" xmlns:w16cex="http://schemas.microsoft.com/office/word/2018/wordml/cex" xmlns:w16cid="http://schemas.microsoft.com/office/word/2016/wordml/cid" xmlns:w16="http://schemas.microsoft.com/office/word/2018/wordml" xmlns:w16du="http://schemas.microsoft.com/office/word/2023/wordml/word16du" xmlns:w16sdtdh="http://schemas.microsoft.com/office/word/2020/wordml/sdtdatahash" xmlns:w16sdtfl="http://schemas.microsoft.com/office/word/2024/wordml/sdtformatlock" xmlns:w16se="http://schemas.microsoft.com/office/word/2015/wordml/symex" xmlns:wpg="http://schemas.microsoft.com/office/word/2010/wordprocessingGroup" xmlns:wpi="http://schemas.microsoft.com/office/word/2010/wordprocessingInk" xmlns:wne="http://schemas.microsoft.com/office/word/2006/wordml" xmlns:wps="http://schemas.microsoft.com/office/word/2010/wordprocessingShape" mc:Ignorable="w14 w15 w16se w16cid w16 w16cex w16sdtdh w16sdtfl w16du wp14">
+  <w15:person w15:author="Xu, Jingyi">
+    <w15:presenceInfo w15:providerId="AD" w15:userId="S::jxx240004@utdallas.edu::88e6f708-e560-4dc4-bd16-2d9be0122e4c"/>
+  </w15:person>
+</w15:people>
 </file>
 
 <file path=word/styles.xml><?xml version="1.0" encoding="utf-8"?>
@@ -4041,7 +5891,6 @@
     <w:basedOn w:val="Normal"/>
     <w:link w:val="CommentTextChar"/>
     <w:uiPriority w:val="99"/>
-    <w:semiHidden/>
     <w:unhideWhenUsed/>
     <w:rsid w:val="008E6353"/>
     <w:rPr>
@@ -4054,7 +5903,6 @@
     <w:basedOn w:val="DefaultParagraphFont"/>
     <w:link w:val="CommentText"/>
     <w:uiPriority w:val="99"/>
-    <w:semiHidden/>
     <w:rsid w:val="008E6353"/>
     <w:rPr>
       <w:sz w:val="20"/>

</xml_diff>

<commit_message>
Word doc fixes: date format MM/DD/YYYY, Spanish Nino/Nina gender, Mandarin gender/age fields
</commit_message>
<xml_diff>
--- a/public/templates/MBCDI report ME 16-30mo_AT RISK.docx
+++ b/public/templates/MBCDI report ME 16-30mo_AT RISK.docx
@@ -3152,7 +3152,6 @@
                 <w:rFonts w:ascii="KaiTi" w:eastAsia="KaiTi" w:hAnsi="KaiTi" w:cs="Arial"/>
               </w:rPr>
             </w:pPr>
-            <w:commentRangeStart w:id="0"/>
             <w:r>
               <w:rPr>
                 <w:rFonts w:ascii="KaiTi" w:eastAsia="KaiTi" w:hAnsi="KaiTi" w:cs="Arial" w:hint="eastAsia"/>
@@ -3160,18 +3159,6 @@
                 <w:bCs/>
               </w:rPr>
               <w:t>性别</w:t>
-            </w:r>
-            <w:commentRangeEnd w:id="0"/>
-            <w:r>
-              <w:rPr>
-                <w:rStyle w:val="CommentReference"/>
-                <w:rFonts w:ascii="KaiTi" w:eastAsia="KaiTi" w:hAnsi="KaiTi" w:cs="Arial"/>
-                <w:b/>
-                <w:bCs/>
-                <w:sz w:val="24"/>
-                <w:szCs w:val="24"/>
-              </w:rPr>
-              <w:commentReference w:id="0"/>
             </w:r>
             <w:r>
               <w:rPr>
@@ -3726,8 +3713,8 @@
       </w:pPr>
     </w:p>
     <w:sectPr>
-      <w:headerReference w:type="default" r:id="rId19"/>
-      <w:footerReference w:type="default" r:id="rId20"/>
+      <w:headerReference w:type="default" r:id="rId15"/>
+      <w:footerReference w:type="default" r:id="rId16"/>
       <w:pgSz w:w="12240" w:h="15840"/>
       <w:pgMar w:top="1440" w:right="1440" w:bottom="1440" w:left="1440" w:header="720" w:footer="720" w:gutter="0"/>
       <w:cols w:space="720"/>
@@ -3735,65 +3722,6 @@
     </w:sectPr>
   </w:body>
 </w:document>
-</file>
-
-<file path=word/comments.xml><?xml version="1.0" encoding="utf-8"?>
-<w:comments xmlns:wpc="http://schemas.microsoft.com/office/word/2010/wordprocessingCanvas" xmlns:cx="http://schemas.microsoft.com/office/drawing/2014/chartex" xmlns:cx1="http://schemas.microsoft.com/office/drawing/2015/9/8/chartex" xmlns:cx2="http://schemas.microsoft.com/office/drawing/2015/10/21/chartex" xmlns:cx3="http://schemas.microsoft.com/office/drawing/2016/5/9/chartex" xmlns:cx4="http://schemas.microsoft.com/office/drawing/2016/5/10/chartex" xmlns:cx5="http://schemas.microsoft.com/office/drawing/2016/5/11/chartex" xmlns:cx6="http://schemas.microsoft.com/office/drawing/2016/5/12/chartex" xmlns:cx7="http://schemas.microsoft.com/office/drawing/2016/5/13/chartex" xmlns:cx8="http://schemas.microsoft.com/office/drawing/2016/5/14/chartex" xmlns:mc="http://schemas.openxmlformats.org/markup-compatibility/2006" xmlns:aink="http://schemas.microsoft.com/office/drawing/2016/ink" xmlns:am3d="http://schemas.microsoft.com/office/drawing/2017/model3d" xmlns:o="urn:schemas-microsoft-com:office:office" xmlns:oel="http://schemas.microsoft.com/office/2019/extlst" xmlns:r="http://schemas.openxmlformats.org/officeDocument/2006/relationships" xmlns:m="http://schemas.openxmlformats.org/officeDocument/2006/math" xmlns:v="urn:schemas-microsoft-com:vml" xmlns:wp14="http://schemas.microsoft.com/office/word/2010/wordprocessingDrawing" xmlns:wp="http://schemas.openxmlformats.org/drawingml/2006/wordprocessingDrawing" xmlns:w10="urn:schemas-microsoft-com:office:word" xmlns:w="http://schemas.openxmlformats.org/wordprocessingml/2006/main" xmlns:w14="http://schemas.microsoft.com/office/word/2010/wordml" xmlns:w15="http://schemas.microsoft.com/office/word/2012/wordml" xmlns:w16cex="http://schemas.microsoft.com/office/word/2018/wordml/cex" xmlns:w16cid="http://schemas.microsoft.com/office/word/2016/wordml/cid" xmlns:w16="http://schemas.microsoft.com/office/word/2018/wordml" xmlns:w16du="http://schemas.microsoft.com/office/word/2023/wordml/word16du" xmlns:w16sdtdh="http://schemas.microsoft.com/office/word/2020/wordml/sdtdatahash" xmlns:w16sdtfl="http://schemas.microsoft.com/office/word/2024/wordml/sdtformatlock" xmlns:w16se="http://schemas.microsoft.com/office/word/2015/wordml/symex" xmlns:wpg="http://schemas.microsoft.com/office/word/2010/wordprocessingGroup" xmlns:wpi="http://schemas.microsoft.com/office/word/2010/wordprocessingInk" xmlns:wne="http://schemas.microsoft.com/office/word/2006/wordml" xmlns:wps="http://schemas.microsoft.com/office/word/2010/wordprocessingShape" mc:Ignorable="w14 w15 w16se w16cid w16 w16cex w16sdtdh w16sdtfl w16du wp14">
-  <w:comment w:id="0" w:author="Xu, Jingyi" w:date="2026-04-13T11:47:00Z" w:initials="JX">
-    <w:p>
-      <w:pPr>
-        <w:pStyle w:val="CommentText"/>
-      </w:pPr>
-      <w:r>
-        <w:rPr>
-          <w:rStyle w:val="CommentReference"/>
-        </w:rPr>
-        <w:annotationRef/>
-      </w:r>
-      <w:r>
-        <w:t xml:space="preserve">Boy: </w:t>
-      </w:r>
-      <w:r>
-        <w:rPr>
-          <w:rFonts w:hint="eastAsia"/>
-        </w:rPr>
-        <w:t>男</w:t>
-      </w:r>
-    </w:p>
-    <w:p>
-      <w:pPr>
-        <w:pStyle w:val="CommentText"/>
-      </w:pPr>
-      <w:r>
-        <w:t xml:space="preserve">Girl: </w:t>
-      </w:r>
-      <w:r>
-        <w:rPr>
-          <w:rFonts w:hint="eastAsia"/>
-        </w:rPr>
-        <w:t>女</w:t>
-      </w:r>
-    </w:p>
-  </w:comment>
-</w:comments>
-</file>
-
-<file path=word/commentsExtended.xml><?xml version="1.0" encoding="utf-8"?>
-<w15:commentsEx xmlns:wpc="http://schemas.microsoft.com/office/word/2010/wordprocessingCanvas" xmlns:cx="http://schemas.microsoft.com/office/drawing/2014/chartex" xmlns:cx1="http://schemas.microsoft.com/office/drawing/2015/9/8/chartex" xmlns:cx2="http://schemas.microsoft.com/office/drawing/2015/10/21/chartex" xmlns:cx3="http://schemas.microsoft.com/office/drawing/2016/5/9/chartex" xmlns:cx4="http://schemas.microsoft.com/office/drawing/2016/5/10/chartex" xmlns:cx5="http://schemas.microsoft.com/office/drawing/2016/5/11/chartex" xmlns:cx6="http://schemas.microsoft.com/office/drawing/2016/5/12/chartex" xmlns:cx7="http://schemas.microsoft.com/office/drawing/2016/5/13/chartex" xmlns:cx8="http://schemas.microsoft.com/office/drawing/2016/5/14/chartex" xmlns:mc="http://schemas.openxmlformats.org/markup-compatibility/2006" xmlns:aink="http://schemas.microsoft.com/office/drawing/2016/ink" xmlns:am3d="http://schemas.microsoft.com/office/drawing/2017/model3d" xmlns:o="urn:schemas-microsoft-com:office:office" xmlns:oel="http://schemas.microsoft.com/office/2019/extlst" xmlns:r="http://schemas.openxmlformats.org/officeDocument/2006/relationships" xmlns:m="http://schemas.openxmlformats.org/officeDocument/2006/math" xmlns:v="urn:schemas-microsoft-com:vml" xmlns:wp14="http://schemas.microsoft.com/office/word/2010/wordprocessingDrawing" xmlns:wp="http://schemas.openxmlformats.org/drawingml/2006/wordprocessingDrawing" xmlns:w10="urn:schemas-microsoft-com:office:word" xmlns:w="http://schemas.openxmlformats.org/wordprocessingml/2006/main" xmlns:w14="http://schemas.microsoft.com/office/word/2010/wordml" xmlns:w15="http://schemas.microsoft.com/office/word/2012/wordml" xmlns:w16cex="http://schemas.microsoft.com/office/word/2018/wordml/cex" xmlns:w16cid="http://schemas.microsoft.com/office/word/2016/wordml/cid" xmlns:w16="http://schemas.microsoft.com/office/word/2018/wordml" xmlns:w16du="http://schemas.microsoft.com/office/word/2023/wordml/word16du" xmlns:w16sdtdh="http://schemas.microsoft.com/office/word/2020/wordml/sdtdatahash" xmlns:w16sdtfl="http://schemas.microsoft.com/office/word/2024/wordml/sdtformatlock" xmlns:w16se="http://schemas.microsoft.com/office/word/2015/wordml/symex" xmlns:wpg="http://schemas.microsoft.com/office/word/2010/wordprocessingGroup" xmlns:wpi="http://schemas.microsoft.com/office/word/2010/wordprocessingInk" xmlns:wne="http://schemas.microsoft.com/office/word/2006/wordml" xmlns:wps="http://schemas.microsoft.com/office/word/2010/wordprocessingShape" mc:Ignorable="w14 w15 w16se w16cid w16 w16cex w16sdtdh w16sdtfl w16du wp14">
-  <w15:commentEx w15:paraId="6ACF8584" w15:done="0"/>
-</w15:commentsEx>
-</file>
-
-<file path=word/commentsExtensible.xml><?xml version="1.0" encoding="utf-8"?>
-<w16cex:commentsExtensible xmlns:wpc="http://schemas.microsoft.com/office/word/2010/wordprocessingCanvas" xmlns:cx="http://schemas.microsoft.com/office/drawing/2014/chartex" xmlns:cx1="http://schemas.microsoft.com/office/drawing/2015/9/8/chartex" xmlns:cx2="http://schemas.microsoft.com/office/drawing/2015/10/21/chartex" xmlns:cx3="http://schemas.microsoft.com/office/drawing/2016/5/9/chartex" xmlns:cx4="http://schemas.microsoft.com/office/drawing/2016/5/10/chartex" xmlns:cx5="http://schemas.microsoft.com/office/drawing/2016/5/11/chartex" xmlns:cx6="http://schemas.microsoft.com/office/drawing/2016/5/12/chartex" xmlns:cx7="http://schemas.microsoft.com/office/drawing/2016/5/13/chartex" xmlns:cx8="http://schemas.microsoft.com/office/drawing/2016/5/14/chartex" xmlns:cr="http://schemas.microsoft.com/office/comments/2020/reactions" xmlns:mc="http://schemas.openxmlformats.org/markup-compatibility/2006" xmlns:aink="http://schemas.microsoft.com/office/drawing/2016/ink" xmlns:am3d="http://schemas.microsoft.com/office/drawing/2017/model3d" xmlns:o="urn:schemas-microsoft-com:office:office" xmlns:oel="http://schemas.microsoft.com/office/2019/extlst" xmlns:r="http://schemas.openxmlformats.org/officeDocument/2006/relationships" xmlns:m="http://schemas.openxmlformats.org/officeDocument/2006/math" xmlns:v="urn:schemas-microsoft-com:vml" xmlns:wp14="http://schemas.microsoft.com/office/word/2010/wordprocessingDrawing" xmlns:wp="http://schemas.openxmlformats.org/drawingml/2006/wordprocessingDrawing" xmlns:w10="urn:schemas-microsoft-com:office:word" xmlns:w="http://schemas.openxmlformats.org/wordprocessingml/2006/main" xmlns:w14="http://schemas.microsoft.com/office/word/2010/wordml" xmlns:w15="http://schemas.microsoft.com/office/word/2012/wordml" xmlns:w16cex="http://schemas.microsoft.com/office/word/2018/wordml/cex" xmlns:w16cid="http://schemas.microsoft.com/office/word/2016/wordml/cid" xmlns:w16="http://schemas.microsoft.com/office/word/2018/wordml" xmlns:w16du="http://schemas.microsoft.com/office/word/2023/wordml/word16du" xmlns:w16sdtdh="http://schemas.microsoft.com/office/word/2020/wordml/sdtdatahash" xmlns:w16sdtfl="http://schemas.microsoft.com/office/word/2024/wordml/sdtformatlock" xmlns:w16se="http://schemas.microsoft.com/office/word/2015/wordml/symex" xmlns:wpg="http://schemas.microsoft.com/office/word/2010/wordprocessingGroup" xmlns:wpi="http://schemas.microsoft.com/office/word/2010/wordprocessingInk" xmlns:wne="http://schemas.microsoft.com/office/word/2006/wordml" xmlns:wps="http://schemas.microsoft.com/office/word/2010/wordprocessingShape" mc:Ignorable="w14 w15 w16se w16cid w16 w16cex w16sdtdh w16sdtfl cr w16du wp14">
-  <w16cex:commentExtensible w16cex:durableId="4DCB12D2" w16cex:dateUtc="2026-04-13T16:47:00Z"/>
-</w16cex:commentsExtensible>
-</file>
-
-<file path=word/commentsIds.xml><?xml version="1.0" encoding="utf-8"?>
-<w16cid:commentsIds xmlns:wpc="http://schemas.microsoft.com/office/word/2010/wordprocessingCanvas" xmlns:cx="http://schemas.microsoft.com/office/drawing/2014/chartex" xmlns:cx1="http://schemas.microsoft.com/office/drawing/2015/9/8/chartex" xmlns:cx2="http://schemas.microsoft.com/office/drawing/2015/10/21/chartex" xmlns:cx3="http://schemas.microsoft.com/office/drawing/2016/5/9/chartex" xmlns:cx4="http://schemas.microsoft.com/office/drawing/2016/5/10/chartex" xmlns:cx5="http://schemas.microsoft.com/office/drawing/2016/5/11/chartex" xmlns:cx6="http://schemas.microsoft.com/office/drawing/2016/5/12/chartex" xmlns:cx7="http://schemas.microsoft.com/office/drawing/2016/5/13/chartex" xmlns:cx8="http://schemas.microsoft.com/office/drawing/2016/5/14/chartex" xmlns:mc="http://schemas.openxmlformats.org/markup-compatibility/2006" xmlns:aink="http://schemas.microsoft.com/office/drawing/2016/ink" xmlns:am3d="http://schemas.microsoft.com/office/drawing/2017/model3d" xmlns:o="urn:schemas-microsoft-com:office:office" xmlns:oel="http://schemas.microsoft.com/office/2019/extlst" xmlns:r="http://schemas.openxmlformats.org/officeDocument/2006/relationships" xmlns:m="http://schemas.openxmlformats.org/officeDocument/2006/math" xmlns:v="urn:schemas-microsoft-com:vml" xmlns:wp14="http://schemas.microsoft.com/office/word/2010/wordprocessingDrawing" xmlns:wp="http://schemas.openxmlformats.org/drawingml/2006/wordprocessingDrawing" xmlns:w10="urn:schemas-microsoft-com:office:word" xmlns:w="http://schemas.openxmlformats.org/wordprocessingml/2006/main" xmlns:w14="http://schemas.microsoft.com/office/word/2010/wordml" xmlns:w15="http://schemas.microsoft.com/office/word/2012/wordml" xmlns:w16cex="http://schemas.microsoft.com/office/word/2018/wordml/cex" xmlns:w16cid="http://schemas.microsoft.com/office/word/2016/wordml/cid" xmlns:w16="http://schemas.microsoft.com/office/word/2018/wordml" xmlns:w16du="http://schemas.microsoft.com/office/word/2023/wordml/word16du" xmlns:w16sdtdh="http://schemas.microsoft.com/office/word/2020/wordml/sdtdatahash" xmlns:w16sdtfl="http://schemas.microsoft.com/office/word/2024/wordml/sdtformatlock" xmlns:w16se="http://schemas.microsoft.com/office/word/2015/wordml/symex" xmlns:wpg="http://schemas.microsoft.com/office/word/2010/wordprocessingGroup" xmlns:wpi="http://schemas.microsoft.com/office/word/2010/wordprocessingInk" xmlns:wne="http://schemas.microsoft.com/office/word/2006/wordml" xmlns:wps="http://schemas.microsoft.com/office/word/2010/wordprocessingShape" mc:Ignorable="w14 w15 w16se w16cid w16 w16cex w16sdtdh w16sdtfl w16du wp14">
-  <w16cid:commentId w16cid:paraId="6ACF8584" w16cid:durableId="4DCB12D2"/>
-</w16cid:commentsIds>
 </file>
 
 <file path=word/endnotes.xml><?xml version="1.0" encoding="utf-8"?>
@@ -4676,14 +4604,6 @@
     <w:abstractNumId w:val="0"/>
   </w:num>
 </w:numbering>
-</file>
-
-<file path=word/people.xml><?xml version="1.0" encoding="utf-8"?>
-<w15:people xmlns:wpc="http://schemas.microsoft.com/office/word/2010/wordprocessingCanvas" xmlns:cx="http://schemas.microsoft.com/office/drawing/2014/chartex" xmlns:cx1="http://schemas.microsoft.com/office/drawing/2015/9/8/chartex" xmlns:cx2="http://schemas.microsoft.com/office/drawing/2015/10/21/chartex" xmlns:cx3="http://schemas.microsoft.com/office/drawing/2016/5/9/chartex" xmlns:cx4="http://schemas.microsoft.com/office/drawing/2016/5/10/chartex" xmlns:cx5="http://schemas.microsoft.com/office/drawing/2016/5/11/chartex" xmlns:cx6="http://schemas.microsoft.com/office/drawing/2016/5/12/chartex" xmlns:cx7="http://schemas.microsoft.com/office/drawing/2016/5/13/chartex" xmlns:cx8="http://schemas.microsoft.com/office/drawing/2016/5/14/chartex" xmlns:mc="http://schemas.openxmlformats.org/markup-compatibility/2006" xmlns:aink="http://schemas.microsoft.com/office/drawing/2016/ink" xmlns:am3d="http://schemas.microsoft.com/office/drawing/2017/model3d" xmlns:o="urn:schemas-microsoft-com:office:office" xmlns:oel="http://schemas.microsoft.com/office/2019/extlst" xmlns:r="http://schemas.openxmlformats.org/officeDocument/2006/relationships" xmlns:m="http://schemas.openxmlformats.org/officeDocument/2006/math" xmlns:v="urn:schemas-microsoft-com:vml" xmlns:wp14="http://schemas.microsoft.com/office/word/2010/wordprocessingDrawing" xmlns:wp="http://schemas.openxmlformats.org/drawingml/2006/wordprocessingDrawing" xmlns:w10="urn:schemas-microsoft-com:office:word" xmlns:w="http://schemas.openxmlformats.org/wordprocessingml/2006/main" xmlns:w14="http://schemas.microsoft.com/office/word/2010/wordml" xmlns:w15="http://schemas.microsoft.com/office/word/2012/wordml" xmlns:w16cex="http://schemas.microsoft.com/office/word/2018/wordml/cex" xmlns:w16cid="http://schemas.microsoft.com/office/word/2016/wordml/cid" xmlns:w16="http://schemas.microsoft.com/office/word/2018/wordml" xmlns:w16du="http://schemas.microsoft.com/office/word/2023/wordml/word16du" xmlns:w16sdtdh="http://schemas.microsoft.com/office/word/2020/wordml/sdtdatahash" xmlns:w16sdtfl="http://schemas.microsoft.com/office/word/2024/wordml/sdtformatlock" xmlns:w16se="http://schemas.microsoft.com/office/word/2015/wordml/symex" xmlns:wpg="http://schemas.microsoft.com/office/word/2010/wordprocessingGroup" xmlns:wpi="http://schemas.microsoft.com/office/word/2010/wordprocessingInk" xmlns:wne="http://schemas.microsoft.com/office/word/2006/wordml" xmlns:wps="http://schemas.microsoft.com/office/word/2010/wordprocessingShape" mc:Ignorable="w14 w15 w16se w16cid w16 w16cex w16sdtdh w16sdtfl w16du wp14">
-  <w15:person w15:author="Xu, Jingyi">
-    <w15:presenceInfo w15:providerId="AD" w15:userId="S::jxx240004@utdallas.edu::88e6f708-e560-4dc4-bd16-2d9be0122e4c"/>
-  </w15:person>
-</w15:people>
 </file>
 
 <file path=word/styles.xml><?xml version="1.0" encoding="utf-8"?>

</xml_diff>

<commit_message>
Revert "Word doc fixes: date format MM/DD/YYYY, Spanish Nino/Nina gender, Mandarin gender/age fields"
This reverts commit 38e193873864b000f46321dfe33f3a11cbde2614.
</commit_message>
<xml_diff>
--- a/public/templates/MBCDI report ME 16-30mo_AT RISK.docx
+++ b/public/templates/MBCDI report ME 16-30mo_AT RISK.docx
@@ -3152,6 +3152,7 @@
                 <w:rFonts w:ascii="KaiTi" w:eastAsia="KaiTi" w:hAnsi="KaiTi" w:cs="Arial"/>
               </w:rPr>
             </w:pPr>
+            <w:commentRangeStart w:id="0"/>
             <w:r>
               <w:rPr>
                 <w:rFonts w:ascii="KaiTi" w:eastAsia="KaiTi" w:hAnsi="KaiTi" w:cs="Arial" w:hint="eastAsia"/>
@@ -3159,6 +3160,18 @@
                 <w:bCs/>
               </w:rPr>
               <w:t>性别</w:t>
+            </w:r>
+            <w:commentRangeEnd w:id="0"/>
+            <w:r>
+              <w:rPr>
+                <w:rStyle w:val="CommentReference"/>
+                <w:rFonts w:ascii="KaiTi" w:eastAsia="KaiTi" w:hAnsi="KaiTi" w:cs="Arial"/>
+                <w:b/>
+                <w:bCs/>
+                <w:sz w:val="24"/>
+                <w:szCs w:val="24"/>
+              </w:rPr>
+              <w:commentReference w:id="0"/>
             </w:r>
             <w:r>
               <w:rPr>
@@ -3713,8 +3726,8 @@
       </w:pPr>
     </w:p>
     <w:sectPr>
-      <w:headerReference w:type="default" r:id="rId15"/>
-      <w:footerReference w:type="default" r:id="rId16"/>
+      <w:headerReference w:type="default" r:id="rId19"/>
+      <w:footerReference w:type="default" r:id="rId20"/>
       <w:pgSz w:w="12240" w:h="15840"/>
       <w:pgMar w:top="1440" w:right="1440" w:bottom="1440" w:left="1440" w:header="720" w:footer="720" w:gutter="0"/>
       <w:cols w:space="720"/>
@@ -3722,6 +3735,65 @@
     </w:sectPr>
   </w:body>
 </w:document>
+</file>
+
+<file path=word/comments.xml><?xml version="1.0" encoding="utf-8"?>
+<w:comments xmlns:wpc="http://schemas.microsoft.com/office/word/2010/wordprocessingCanvas" xmlns:cx="http://schemas.microsoft.com/office/drawing/2014/chartex" xmlns:cx1="http://schemas.microsoft.com/office/drawing/2015/9/8/chartex" xmlns:cx2="http://schemas.microsoft.com/office/drawing/2015/10/21/chartex" xmlns:cx3="http://schemas.microsoft.com/office/drawing/2016/5/9/chartex" xmlns:cx4="http://schemas.microsoft.com/office/drawing/2016/5/10/chartex" xmlns:cx5="http://schemas.microsoft.com/office/drawing/2016/5/11/chartex" xmlns:cx6="http://schemas.microsoft.com/office/drawing/2016/5/12/chartex" xmlns:cx7="http://schemas.microsoft.com/office/drawing/2016/5/13/chartex" xmlns:cx8="http://schemas.microsoft.com/office/drawing/2016/5/14/chartex" xmlns:mc="http://schemas.openxmlformats.org/markup-compatibility/2006" xmlns:aink="http://schemas.microsoft.com/office/drawing/2016/ink" xmlns:am3d="http://schemas.microsoft.com/office/drawing/2017/model3d" xmlns:o="urn:schemas-microsoft-com:office:office" xmlns:oel="http://schemas.microsoft.com/office/2019/extlst" xmlns:r="http://schemas.openxmlformats.org/officeDocument/2006/relationships" xmlns:m="http://schemas.openxmlformats.org/officeDocument/2006/math" xmlns:v="urn:schemas-microsoft-com:vml" xmlns:wp14="http://schemas.microsoft.com/office/word/2010/wordprocessingDrawing" xmlns:wp="http://schemas.openxmlformats.org/drawingml/2006/wordprocessingDrawing" xmlns:w10="urn:schemas-microsoft-com:office:word" xmlns:w="http://schemas.openxmlformats.org/wordprocessingml/2006/main" xmlns:w14="http://schemas.microsoft.com/office/word/2010/wordml" xmlns:w15="http://schemas.microsoft.com/office/word/2012/wordml" xmlns:w16cex="http://schemas.microsoft.com/office/word/2018/wordml/cex" xmlns:w16cid="http://schemas.microsoft.com/office/word/2016/wordml/cid" xmlns:w16="http://schemas.microsoft.com/office/word/2018/wordml" xmlns:w16du="http://schemas.microsoft.com/office/word/2023/wordml/word16du" xmlns:w16sdtdh="http://schemas.microsoft.com/office/word/2020/wordml/sdtdatahash" xmlns:w16sdtfl="http://schemas.microsoft.com/office/word/2024/wordml/sdtformatlock" xmlns:w16se="http://schemas.microsoft.com/office/word/2015/wordml/symex" xmlns:wpg="http://schemas.microsoft.com/office/word/2010/wordprocessingGroup" xmlns:wpi="http://schemas.microsoft.com/office/word/2010/wordprocessingInk" xmlns:wne="http://schemas.microsoft.com/office/word/2006/wordml" xmlns:wps="http://schemas.microsoft.com/office/word/2010/wordprocessingShape" mc:Ignorable="w14 w15 w16se w16cid w16 w16cex w16sdtdh w16sdtfl w16du wp14">
+  <w:comment w:id="0" w:author="Xu, Jingyi" w:date="2026-04-13T11:47:00Z" w:initials="JX">
+    <w:p>
+      <w:pPr>
+        <w:pStyle w:val="CommentText"/>
+      </w:pPr>
+      <w:r>
+        <w:rPr>
+          <w:rStyle w:val="CommentReference"/>
+        </w:rPr>
+        <w:annotationRef/>
+      </w:r>
+      <w:r>
+        <w:t xml:space="preserve">Boy: </w:t>
+      </w:r>
+      <w:r>
+        <w:rPr>
+          <w:rFonts w:hint="eastAsia"/>
+        </w:rPr>
+        <w:t>男</w:t>
+      </w:r>
+    </w:p>
+    <w:p>
+      <w:pPr>
+        <w:pStyle w:val="CommentText"/>
+      </w:pPr>
+      <w:r>
+        <w:t xml:space="preserve">Girl: </w:t>
+      </w:r>
+      <w:r>
+        <w:rPr>
+          <w:rFonts w:hint="eastAsia"/>
+        </w:rPr>
+        <w:t>女</w:t>
+      </w:r>
+    </w:p>
+  </w:comment>
+</w:comments>
+</file>
+
+<file path=word/commentsExtended.xml><?xml version="1.0" encoding="utf-8"?>
+<w15:commentsEx xmlns:wpc="http://schemas.microsoft.com/office/word/2010/wordprocessingCanvas" xmlns:cx="http://schemas.microsoft.com/office/drawing/2014/chartex" xmlns:cx1="http://schemas.microsoft.com/office/drawing/2015/9/8/chartex" xmlns:cx2="http://schemas.microsoft.com/office/drawing/2015/10/21/chartex" xmlns:cx3="http://schemas.microsoft.com/office/drawing/2016/5/9/chartex" xmlns:cx4="http://schemas.microsoft.com/office/drawing/2016/5/10/chartex" xmlns:cx5="http://schemas.microsoft.com/office/drawing/2016/5/11/chartex" xmlns:cx6="http://schemas.microsoft.com/office/drawing/2016/5/12/chartex" xmlns:cx7="http://schemas.microsoft.com/office/drawing/2016/5/13/chartex" xmlns:cx8="http://schemas.microsoft.com/office/drawing/2016/5/14/chartex" xmlns:mc="http://schemas.openxmlformats.org/markup-compatibility/2006" xmlns:aink="http://schemas.microsoft.com/office/drawing/2016/ink" xmlns:am3d="http://schemas.microsoft.com/office/drawing/2017/model3d" xmlns:o="urn:schemas-microsoft-com:office:office" xmlns:oel="http://schemas.microsoft.com/office/2019/extlst" xmlns:r="http://schemas.openxmlformats.org/officeDocument/2006/relationships" xmlns:m="http://schemas.openxmlformats.org/officeDocument/2006/math" xmlns:v="urn:schemas-microsoft-com:vml" xmlns:wp14="http://schemas.microsoft.com/office/word/2010/wordprocessingDrawing" xmlns:wp="http://schemas.openxmlformats.org/drawingml/2006/wordprocessingDrawing" xmlns:w10="urn:schemas-microsoft-com:office:word" xmlns:w="http://schemas.openxmlformats.org/wordprocessingml/2006/main" xmlns:w14="http://schemas.microsoft.com/office/word/2010/wordml" xmlns:w15="http://schemas.microsoft.com/office/word/2012/wordml" xmlns:w16cex="http://schemas.microsoft.com/office/word/2018/wordml/cex" xmlns:w16cid="http://schemas.microsoft.com/office/word/2016/wordml/cid" xmlns:w16="http://schemas.microsoft.com/office/word/2018/wordml" xmlns:w16du="http://schemas.microsoft.com/office/word/2023/wordml/word16du" xmlns:w16sdtdh="http://schemas.microsoft.com/office/word/2020/wordml/sdtdatahash" xmlns:w16sdtfl="http://schemas.microsoft.com/office/word/2024/wordml/sdtformatlock" xmlns:w16se="http://schemas.microsoft.com/office/word/2015/wordml/symex" xmlns:wpg="http://schemas.microsoft.com/office/word/2010/wordprocessingGroup" xmlns:wpi="http://schemas.microsoft.com/office/word/2010/wordprocessingInk" xmlns:wne="http://schemas.microsoft.com/office/word/2006/wordml" xmlns:wps="http://schemas.microsoft.com/office/word/2010/wordprocessingShape" mc:Ignorable="w14 w15 w16se w16cid w16 w16cex w16sdtdh w16sdtfl w16du wp14">
+  <w15:commentEx w15:paraId="6ACF8584" w15:done="0"/>
+</w15:commentsEx>
+</file>
+
+<file path=word/commentsExtensible.xml><?xml version="1.0" encoding="utf-8"?>
+<w16cex:commentsExtensible xmlns:wpc="http://schemas.microsoft.com/office/word/2010/wordprocessingCanvas" xmlns:cx="http://schemas.microsoft.com/office/drawing/2014/chartex" xmlns:cx1="http://schemas.microsoft.com/office/drawing/2015/9/8/chartex" xmlns:cx2="http://schemas.microsoft.com/office/drawing/2015/10/21/chartex" xmlns:cx3="http://schemas.microsoft.com/office/drawing/2016/5/9/chartex" xmlns:cx4="http://schemas.microsoft.com/office/drawing/2016/5/10/chartex" xmlns:cx5="http://schemas.microsoft.com/office/drawing/2016/5/11/chartex" xmlns:cx6="http://schemas.microsoft.com/office/drawing/2016/5/12/chartex" xmlns:cx7="http://schemas.microsoft.com/office/drawing/2016/5/13/chartex" xmlns:cx8="http://schemas.microsoft.com/office/drawing/2016/5/14/chartex" xmlns:cr="http://schemas.microsoft.com/office/comments/2020/reactions" xmlns:mc="http://schemas.openxmlformats.org/markup-compatibility/2006" xmlns:aink="http://schemas.microsoft.com/office/drawing/2016/ink" xmlns:am3d="http://schemas.microsoft.com/office/drawing/2017/model3d" xmlns:o="urn:schemas-microsoft-com:office:office" xmlns:oel="http://schemas.microsoft.com/office/2019/extlst" xmlns:r="http://schemas.openxmlformats.org/officeDocument/2006/relationships" xmlns:m="http://schemas.openxmlformats.org/officeDocument/2006/math" xmlns:v="urn:schemas-microsoft-com:vml" xmlns:wp14="http://schemas.microsoft.com/office/word/2010/wordprocessingDrawing" xmlns:wp="http://schemas.openxmlformats.org/drawingml/2006/wordprocessingDrawing" xmlns:w10="urn:schemas-microsoft-com:office:word" xmlns:w="http://schemas.openxmlformats.org/wordprocessingml/2006/main" xmlns:w14="http://schemas.microsoft.com/office/word/2010/wordml" xmlns:w15="http://schemas.microsoft.com/office/word/2012/wordml" xmlns:w16cex="http://schemas.microsoft.com/office/word/2018/wordml/cex" xmlns:w16cid="http://schemas.microsoft.com/office/word/2016/wordml/cid" xmlns:w16="http://schemas.microsoft.com/office/word/2018/wordml" xmlns:w16du="http://schemas.microsoft.com/office/word/2023/wordml/word16du" xmlns:w16sdtdh="http://schemas.microsoft.com/office/word/2020/wordml/sdtdatahash" xmlns:w16sdtfl="http://schemas.microsoft.com/office/word/2024/wordml/sdtformatlock" xmlns:w16se="http://schemas.microsoft.com/office/word/2015/wordml/symex" xmlns:wpg="http://schemas.microsoft.com/office/word/2010/wordprocessingGroup" xmlns:wpi="http://schemas.microsoft.com/office/word/2010/wordprocessingInk" xmlns:wne="http://schemas.microsoft.com/office/word/2006/wordml" xmlns:wps="http://schemas.microsoft.com/office/word/2010/wordprocessingShape" mc:Ignorable="w14 w15 w16se w16cid w16 w16cex w16sdtdh w16sdtfl cr w16du wp14">
+  <w16cex:commentExtensible w16cex:durableId="4DCB12D2" w16cex:dateUtc="2026-04-13T16:47:00Z"/>
+</w16cex:commentsExtensible>
+</file>
+
+<file path=word/commentsIds.xml><?xml version="1.0" encoding="utf-8"?>
+<w16cid:commentsIds xmlns:wpc="http://schemas.microsoft.com/office/word/2010/wordprocessingCanvas" xmlns:cx="http://schemas.microsoft.com/office/drawing/2014/chartex" xmlns:cx1="http://schemas.microsoft.com/office/drawing/2015/9/8/chartex" xmlns:cx2="http://schemas.microsoft.com/office/drawing/2015/10/21/chartex" xmlns:cx3="http://schemas.microsoft.com/office/drawing/2016/5/9/chartex" xmlns:cx4="http://schemas.microsoft.com/office/drawing/2016/5/10/chartex" xmlns:cx5="http://schemas.microsoft.com/office/drawing/2016/5/11/chartex" xmlns:cx6="http://schemas.microsoft.com/office/drawing/2016/5/12/chartex" xmlns:cx7="http://schemas.microsoft.com/office/drawing/2016/5/13/chartex" xmlns:cx8="http://schemas.microsoft.com/office/drawing/2016/5/14/chartex" xmlns:mc="http://schemas.openxmlformats.org/markup-compatibility/2006" xmlns:aink="http://schemas.microsoft.com/office/drawing/2016/ink" xmlns:am3d="http://schemas.microsoft.com/office/drawing/2017/model3d" xmlns:o="urn:schemas-microsoft-com:office:office" xmlns:oel="http://schemas.microsoft.com/office/2019/extlst" xmlns:r="http://schemas.openxmlformats.org/officeDocument/2006/relationships" xmlns:m="http://schemas.openxmlformats.org/officeDocument/2006/math" xmlns:v="urn:schemas-microsoft-com:vml" xmlns:wp14="http://schemas.microsoft.com/office/word/2010/wordprocessingDrawing" xmlns:wp="http://schemas.openxmlformats.org/drawingml/2006/wordprocessingDrawing" xmlns:w10="urn:schemas-microsoft-com:office:word" xmlns:w="http://schemas.openxmlformats.org/wordprocessingml/2006/main" xmlns:w14="http://schemas.microsoft.com/office/word/2010/wordml" xmlns:w15="http://schemas.microsoft.com/office/word/2012/wordml" xmlns:w16cex="http://schemas.microsoft.com/office/word/2018/wordml/cex" xmlns:w16cid="http://schemas.microsoft.com/office/word/2016/wordml/cid" xmlns:w16="http://schemas.microsoft.com/office/word/2018/wordml" xmlns:w16du="http://schemas.microsoft.com/office/word/2023/wordml/word16du" xmlns:w16sdtdh="http://schemas.microsoft.com/office/word/2020/wordml/sdtdatahash" xmlns:w16sdtfl="http://schemas.microsoft.com/office/word/2024/wordml/sdtformatlock" xmlns:w16se="http://schemas.microsoft.com/office/word/2015/wordml/symex" xmlns:wpg="http://schemas.microsoft.com/office/word/2010/wordprocessingGroup" xmlns:wpi="http://schemas.microsoft.com/office/word/2010/wordprocessingInk" xmlns:wne="http://schemas.microsoft.com/office/word/2006/wordml" xmlns:wps="http://schemas.microsoft.com/office/word/2010/wordprocessingShape" mc:Ignorable="w14 w15 w16se w16cid w16 w16cex w16sdtdh w16sdtfl w16du wp14">
+  <w16cid:commentId w16cid:paraId="6ACF8584" w16cid:durableId="4DCB12D2"/>
+</w16cid:commentsIds>
 </file>
 
 <file path=word/endnotes.xml><?xml version="1.0" encoding="utf-8"?>
@@ -4604,6 +4676,14 @@
     <w:abstractNumId w:val="0"/>
   </w:num>
 </w:numbering>
+</file>
+
+<file path=word/people.xml><?xml version="1.0" encoding="utf-8"?>
+<w15:people xmlns:wpc="http://schemas.microsoft.com/office/word/2010/wordprocessingCanvas" xmlns:cx="http://schemas.microsoft.com/office/drawing/2014/chartex" xmlns:cx1="http://schemas.microsoft.com/office/drawing/2015/9/8/chartex" xmlns:cx2="http://schemas.microsoft.com/office/drawing/2015/10/21/chartex" xmlns:cx3="http://schemas.microsoft.com/office/drawing/2016/5/9/chartex" xmlns:cx4="http://schemas.microsoft.com/office/drawing/2016/5/10/chartex" xmlns:cx5="http://schemas.microsoft.com/office/drawing/2016/5/11/chartex" xmlns:cx6="http://schemas.microsoft.com/office/drawing/2016/5/12/chartex" xmlns:cx7="http://schemas.microsoft.com/office/drawing/2016/5/13/chartex" xmlns:cx8="http://schemas.microsoft.com/office/drawing/2016/5/14/chartex" xmlns:mc="http://schemas.openxmlformats.org/markup-compatibility/2006" xmlns:aink="http://schemas.microsoft.com/office/drawing/2016/ink" xmlns:am3d="http://schemas.microsoft.com/office/drawing/2017/model3d" xmlns:o="urn:schemas-microsoft-com:office:office" xmlns:oel="http://schemas.microsoft.com/office/2019/extlst" xmlns:r="http://schemas.openxmlformats.org/officeDocument/2006/relationships" xmlns:m="http://schemas.openxmlformats.org/officeDocument/2006/math" xmlns:v="urn:schemas-microsoft-com:vml" xmlns:wp14="http://schemas.microsoft.com/office/word/2010/wordprocessingDrawing" xmlns:wp="http://schemas.openxmlformats.org/drawingml/2006/wordprocessingDrawing" xmlns:w10="urn:schemas-microsoft-com:office:word" xmlns:w="http://schemas.openxmlformats.org/wordprocessingml/2006/main" xmlns:w14="http://schemas.microsoft.com/office/word/2010/wordml" xmlns:w15="http://schemas.microsoft.com/office/word/2012/wordml" xmlns:w16cex="http://schemas.microsoft.com/office/word/2018/wordml/cex" xmlns:w16cid="http://schemas.microsoft.com/office/word/2016/wordml/cid" xmlns:w16="http://schemas.microsoft.com/office/word/2018/wordml" xmlns:w16du="http://schemas.microsoft.com/office/word/2023/wordml/word16du" xmlns:w16sdtdh="http://schemas.microsoft.com/office/word/2020/wordml/sdtdatahash" xmlns:w16sdtfl="http://schemas.microsoft.com/office/word/2024/wordml/sdtformatlock" xmlns:w16se="http://schemas.microsoft.com/office/word/2015/wordml/symex" xmlns:wpg="http://schemas.microsoft.com/office/word/2010/wordprocessingGroup" xmlns:wpi="http://schemas.microsoft.com/office/word/2010/wordprocessingInk" xmlns:wne="http://schemas.microsoft.com/office/word/2006/wordml" xmlns:wps="http://schemas.microsoft.com/office/word/2010/wordprocessingShape" mc:Ignorable="w14 w15 w16se w16cid w16 w16cex w16sdtdh w16sdtfl w16du wp14">
+  <w15:person w15:author="Xu, Jingyi">
+    <w15:presenceInfo w15:providerId="AD" w15:userId="S::jxx240004@utdallas.edu::88e6f708-e560-4dc4-bd16-2d9be0122e4c"/>
+  </w15:person>
+</w15:people>
 </file>
 
 <file path=word/styles.xml><?xml version="1.0" encoding="utf-8"?>

</xml_diff>

<commit_message>
Fix Mandarin gender/age field replacement order and encoding
</commit_message>
<xml_diff>
--- a/public/templates/MBCDI report ME 16-30mo_AT RISK.docx
+++ b/public/templates/MBCDI report ME 16-30mo_AT RISK.docx
@@ -3152,7 +3152,6 @@
                 <w:rFonts w:ascii="KaiTi" w:eastAsia="KaiTi" w:hAnsi="KaiTi" w:cs="Arial"/>
               </w:rPr>
             </w:pPr>
-            <w:commentRangeStart w:id="0"/>
             <w:r>
               <w:rPr>
                 <w:rFonts w:ascii="KaiTi" w:eastAsia="KaiTi" w:hAnsi="KaiTi" w:cs="Arial" w:hint="eastAsia"/>
@@ -3160,18 +3159,6 @@
                 <w:bCs/>
               </w:rPr>
               <w:t>性别</w:t>
-            </w:r>
-            <w:commentRangeEnd w:id="0"/>
-            <w:r>
-              <w:rPr>
-                <w:rStyle w:val="CommentReference"/>
-                <w:rFonts w:ascii="KaiTi" w:eastAsia="KaiTi" w:hAnsi="KaiTi" w:cs="Arial"/>
-                <w:b/>
-                <w:bCs/>
-                <w:sz w:val="24"/>
-                <w:szCs w:val="24"/>
-              </w:rPr>
-              <w:commentReference w:id="0"/>
             </w:r>
             <w:r>
               <w:rPr>
@@ -3726,8 +3713,8 @@
       </w:pPr>
     </w:p>
     <w:sectPr>
-      <w:headerReference w:type="default" r:id="rId19"/>
-      <w:footerReference w:type="default" r:id="rId20"/>
+      <w:headerReference w:type="default" r:id="rId15"/>
+      <w:footerReference w:type="default" r:id="rId16"/>
       <w:pgSz w:w="12240" w:h="15840"/>
       <w:pgMar w:top="1440" w:right="1440" w:bottom="1440" w:left="1440" w:header="720" w:footer="720" w:gutter="0"/>
       <w:cols w:space="720"/>
@@ -3735,65 +3722,6 @@
     </w:sectPr>
   </w:body>
 </w:document>
-</file>
-
-<file path=word/comments.xml><?xml version="1.0" encoding="utf-8"?>
-<w:comments xmlns:wpc="http://schemas.microsoft.com/office/word/2010/wordprocessingCanvas" xmlns:cx="http://schemas.microsoft.com/office/drawing/2014/chartex" xmlns:cx1="http://schemas.microsoft.com/office/drawing/2015/9/8/chartex" xmlns:cx2="http://schemas.microsoft.com/office/drawing/2015/10/21/chartex" xmlns:cx3="http://schemas.microsoft.com/office/drawing/2016/5/9/chartex" xmlns:cx4="http://schemas.microsoft.com/office/drawing/2016/5/10/chartex" xmlns:cx5="http://schemas.microsoft.com/office/drawing/2016/5/11/chartex" xmlns:cx6="http://schemas.microsoft.com/office/drawing/2016/5/12/chartex" xmlns:cx7="http://schemas.microsoft.com/office/drawing/2016/5/13/chartex" xmlns:cx8="http://schemas.microsoft.com/office/drawing/2016/5/14/chartex" xmlns:mc="http://schemas.openxmlformats.org/markup-compatibility/2006" xmlns:aink="http://schemas.microsoft.com/office/drawing/2016/ink" xmlns:am3d="http://schemas.microsoft.com/office/drawing/2017/model3d" xmlns:o="urn:schemas-microsoft-com:office:office" xmlns:oel="http://schemas.microsoft.com/office/2019/extlst" xmlns:r="http://schemas.openxmlformats.org/officeDocument/2006/relationships" xmlns:m="http://schemas.openxmlformats.org/officeDocument/2006/math" xmlns:v="urn:schemas-microsoft-com:vml" xmlns:wp14="http://schemas.microsoft.com/office/word/2010/wordprocessingDrawing" xmlns:wp="http://schemas.openxmlformats.org/drawingml/2006/wordprocessingDrawing" xmlns:w10="urn:schemas-microsoft-com:office:word" xmlns:w="http://schemas.openxmlformats.org/wordprocessingml/2006/main" xmlns:w14="http://schemas.microsoft.com/office/word/2010/wordml" xmlns:w15="http://schemas.microsoft.com/office/word/2012/wordml" xmlns:w16cex="http://schemas.microsoft.com/office/word/2018/wordml/cex" xmlns:w16cid="http://schemas.microsoft.com/office/word/2016/wordml/cid" xmlns:w16="http://schemas.microsoft.com/office/word/2018/wordml" xmlns:w16du="http://schemas.microsoft.com/office/word/2023/wordml/word16du" xmlns:w16sdtdh="http://schemas.microsoft.com/office/word/2020/wordml/sdtdatahash" xmlns:w16sdtfl="http://schemas.microsoft.com/office/word/2024/wordml/sdtformatlock" xmlns:w16se="http://schemas.microsoft.com/office/word/2015/wordml/symex" xmlns:wpg="http://schemas.microsoft.com/office/word/2010/wordprocessingGroup" xmlns:wpi="http://schemas.microsoft.com/office/word/2010/wordprocessingInk" xmlns:wne="http://schemas.microsoft.com/office/word/2006/wordml" xmlns:wps="http://schemas.microsoft.com/office/word/2010/wordprocessingShape" mc:Ignorable="w14 w15 w16se w16cid w16 w16cex w16sdtdh w16sdtfl w16du wp14">
-  <w:comment w:id="0" w:author="Xu, Jingyi" w:date="2026-04-13T11:47:00Z" w:initials="JX">
-    <w:p>
-      <w:pPr>
-        <w:pStyle w:val="CommentText"/>
-      </w:pPr>
-      <w:r>
-        <w:rPr>
-          <w:rStyle w:val="CommentReference"/>
-        </w:rPr>
-        <w:annotationRef/>
-      </w:r>
-      <w:r>
-        <w:t xml:space="preserve">Boy: </w:t>
-      </w:r>
-      <w:r>
-        <w:rPr>
-          <w:rFonts w:hint="eastAsia"/>
-        </w:rPr>
-        <w:t>男</w:t>
-      </w:r>
-    </w:p>
-    <w:p>
-      <w:pPr>
-        <w:pStyle w:val="CommentText"/>
-      </w:pPr>
-      <w:r>
-        <w:t xml:space="preserve">Girl: </w:t>
-      </w:r>
-      <w:r>
-        <w:rPr>
-          <w:rFonts w:hint="eastAsia"/>
-        </w:rPr>
-        <w:t>女</w:t>
-      </w:r>
-    </w:p>
-  </w:comment>
-</w:comments>
-</file>
-
-<file path=word/commentsExtended.xml><?xml version="1.0" encoding="utf-8"?>
-<w15:commentsEx xmlns:wpc="http://schemas.microsoft.com/office/word/2010/wordprocessingCanvas" xmlns:cx="http://schemas.microsoft.com/office/drawing/2014/chartex" xmlns:cx1="http://schemas.microsoft.com/office/drawing/2015/9/8/chartex" xmlns:cx2="http://schemas.microsoft.com/office/drawing/2015/10/21/chartex" xmlns:cx3="http://schemas.microsoft.com/office/drawing/2016/5/9/chartex" xmlns:cx4="http://schemas.microsoft.com/office/drawing/2016/5/10/chartex" xmlns:cx5="http://schemas.microsoft.com/office/drawing/2016/5/11/chartex" xmlns:cx6="http://schemas.microsoft.com/office/drawing/2016/5/12/chartex" xmlns:cx7="http://schemas.microsoft.com/office/drawing/2016/5/13/chartex" xmlns:cx8="http://schemas.microsoft.com/office/drawing/2016/5/14/chartex" xmlns:mc="http://schemas.openxmlformats.org/markup-compatibility/2006" xmlns:aink="http://schemas.microsoft.com/office/drawing/2016/ink" xmlns:am3d="http://schemas.microsoft.com/office/drawing/2017/model3d" xmlns:o="urn:schemas-microsoft-com:office:office" xmlns:oel="http://schemas.microsoft.com/office/2019/extlst" xmlns:r="http://schemas.openxmlformats.org/officeDocument/2006/relationships" xmlns:m="http://schemas.openxmlformats.org/officeDocument/2006/math" xmlns:v="urn:schemas-microsoft-com:vml" xmlns:wp14="http://schemas.microsoft.com/office/word/2010/wordprocessingDrawing" xmlns:wp="http://schemas.openxmlformats.org/drawingml/2006/wordprocessingDrawing" xmlns:w10="urn:schemas-microsoft-com:office:word" xmlns:w="http://schemas.openxmlformats.org/wordprocessingml/2006/main" xmlns:w14="http://schemas.microsoft.com/office/word/2010/wordml" xmlns:w15="http://schemas.microsoft.com/office/word/2012/wordml" xmlns:w16cex="http://schemas.microsoft.com/office/word/2018/wordml/cex" xmlns:w16cid="http://schemas.microsoft.com/office/word/2016/wordml/cid" xmlns:w16="http://schemas.microsoft.com/office/word/2018/wordml" xmlns:w16du="http://schemas.microsoft.com/office/word/2023/wordml/word16du" xmlns:w16sdtdh="http://schemas.microsoft.com/office/word/2020/wordml/sdtdatahash" xmlns:w16sdtfl="http://schemas.microsoft.com/office/word/2024/wordml/sdtformatlock" xmlns:w16se="http://schemas.microsoft.com/office/word/2015/wordml/symex" xmlns:wpg="http://schemas.microsoft.com/office/word/2010/wordprocessingGroup" xmlns:wpi="http://schemas.microsoft.com/office/word/2010/wordprocessingInk" xmlns:wne="http://schemas.microsoft.com/office/word/2006/wordml" xmlns:wps="http://schemas.microsoft.com/office/word/2010/wordprocessingShape" mc:Ignorable="w14 w15 w16se w16cid w16 w16cex w16sdtdh w16sdtfl w16du wp14">
-  <w15:commentEx w15:paraId="6ACF8584" w15:done="0"/>
-</w15:commentsEx>
-</file>
-
-<file path=word/commentsExtensible.xml><?xml version="1.0" encoding="utf-8"?>
-<w16cex:commentsExtensible xmlns:wpc="http://schemas.microsoft.com/office/word/2010/wordprocessingCanvas" xmlns:cx="http://schemas.microsoft.com/office/drawing/2014/chartex" xmlns:cx1="http://schemas.microsoft.com/office/drawing/2015/9/8/chartex" xmlns:cx2="http://schemas.microsoft.com/office/drawing/2015/10/21/chartex" xmlns:cx3="http://schemas.microsoft.com/office/drawing/2016/5/9/chartex" xmlns:cx4="http://schemas.microsoft.com/office/drawing/2016/5/10/chartex" xmlns:cx5="http://schemas.microsoft.com/office/drawing/2016/5/11/chartex" xmlns:cx6="http://schemas.microsoft.com/office/drawing/2016/5/12/chartex" xmlns:cx7="http://schemas.microsoft.com/office/drawing/2016/5/13/chartex" xmlns:cx8="http://schemas.microsoft.com/office/drawing/2016/5/14/chartex" xmlns:cr="http://schemas.microsoft.com/office/comments/2020/reactions" xmlns:mc="http://schemas.openxmlformats.org/markup-compatibility/2006" xmlns:aink="http://schemas.microsoft.com/office/drawing/2016/ink" xmlns:am3d="http://schemas.microsoft.com/office/drawing/2017/model3d" xmlns:o="urn:schemas-microsoft-com:office:office" xmlns:oel="http://schemas.microsoft.com/office/2019/extlst" xmlns:r="http://schemas.openxmlformats.org/officeDocument/2006/relationships" xmlns:m="http://schemas.openxmlformats.org/officeDocument/2006/math" xmlns:v="urn:schemas-microsoft-com:vml" xmlns:wp14="http://schemas.microsoft.com/office/word/2010/wordprocessingDrawing" xmlns:wp="http://schemas.openxmlformats.org/drawingml/2006/wordprocessingDrawing" xmlns:w10="urn:schemas-microsoft-com:office:word" xmlns:w="http://schemas.openxmlformats.org/wordprocessingml/2006/main" xmlns:w14="http://schemas.microsoft.com/office/word/2010/wordml" xmlns:w15="http://schemas.microsoft.com/office/word/2012/wordml" xmlns:w16cex="http://schemas.microsoft.com/office/word/2018/wordml/cex" xmlns:w16cid="http://schemas.microsoft.com/office/word/2016/wordml/cid" xmlns:w16="http://schemas.microsoft.com/office/word/2018/wordml" xmlns:w16du="http://schemas.microsoft.com/office/word/2023/wordml/word16du" xmlns:w16sdtdh="http://schemas.microsoft.com/office/word/2020/wordml/sdtdatahash" xmlns:w16sdtfl="http://schemas.microsoft.com/office/word/2024/wordml/sdtformatlock" xmlns:w16se="http://schemas.microsoft.com/office/word/2015/wordml/symex" xmlns:wpg="http://schemas.microsoft.com/office/word/2010/wordprocessingGroup" xmlns:wpi="http://schemas.microsoft.com/office/word/2010/wordprocessingInk" xmlns:wne="http://schemas.microsoft.com/office/word/2006/wordml" xmlns:wps="http://schemas.microsoft.com/office/word/2010/wordprocessingShape" mc:Ignorable="w14 w15 w16se w16cid w16 w16cex w16sdtdh w16sdtfl cr w16du wp14">
-  <w16cex:commentExtensible w16cex:durableId="4DCB12D2" w16cex:dateUtc="2026-04-13T16:47:00Z"/>
-</w16cex:commentsExtensible>
-</file>
-
-<file path=word/commentsIds.xml><?xml version="1.0" encoding="utf-8"?>
-<w16cid:commentsIds xmlns:wpc="http://schemas.microsoft.com/office/word/2010/wordprocessingCanvas" xmlns:cx="http://schemas.microsoft.com/office/drawing/2014/chartex" xmlns:cx1="http://schemas.microsoft.com/office/drawing/2015/9/8/chartex" xmlns:cx2="http://schemas.microsoft.com/office/drawing/2015/10/21/chartex" xmlns:cx3="http://schemas.microsoft.com/office/drawing/2016/5/9/chartex" xmlns:cx4="http://schemas.microsoft.com/office/drawing/2016/5/10/chartex" xmlns:cx5="http://schemas.microsoft.com/office/drawing/2016/5/11/chartex" xmlns:cx6="http://schemas.microsoft.com/office/drawing/2016/5/12/chartex" xmlns:cx7="http://schemas.microsoft.com/office/drawing/2016/5/13/chartex" xmlns:cx8="http://schemas.microsoft.com/office/drawing/2016/5/14/chartex" xmlns:mc="http://schemas.openxmlformats.org/markup-compatibility/2006" xmlns:aink="http://schemas.microsoft.com/office/drawing/2016/ink" xmlns:am3d="http://schemas.microsoft.com/office/drawing/2017/model3d" xmlns:o="urn:schemas-microsoft-com:office:office" xmlns:oel="http://schemas.microsoft.com/office/2019/extlst" xmlns:r="http://schemas.openxmlformats.org/officeDocument/2006/relationships" xmlns:m="http://schemas.openxmlformats.org/officeDocument/2006/math" xmlns:v="urn:schemas-microsoft-com:vml" xmlns:wp14="http://schemas.microsoft.com/office/word/2010/wordprocessingDrawing" xmlns:wp="http://schemas.openxmlformats.org/drawingml/2006/wordprocessingDrawing" xmlns:w10="urn:schemas-microsoft-com:office:word" xmlns:w="http://schemas.openxmlformats.org/wordprocessingml/2006/main" xmlns:w14="http://schemas.microsoft.com/office/word/2010/wordml" xmlns:w15="http://schemas.microsoft.com/office/word/2012/wordml" xmlns:w16cex="http://schemas.microsoft.com/office/word/2018/wordml/cex" xmlns:w16cid="http://schemas.microsoft.com/office/word/2016/wordml/cid" xmlns:w16="http://schemas.microsoft.com/office/word/2018/wordml" xmlns:w16du="http://schemas.microsoft.com/office/word/2023/wordml/word16du" xmlns:w16sdtdh="http://schemas.microsoft.com/office/word/2020/wordml/sdtdatahash" xmlns:w16sdtfl="http://schemas.microsoft.com/office/word/2024/wordml/sdtformatlock" xmlns:w16se="http://schemas.microsoft.com/office/word/2015/wordml/symex" xmlns:wpg="http://schemas.microsoft.com/office/word/2010/wordprocessingGroup" xmlns:wpi="http://schemas.microsoft.com/office/word/2010/wordprocessingInk" xmlns:wne="http://schemas.microsoft.com/office/word/2006/wordml" xmlns:wps="http://schemas.microsoft.com/office/word/2010/wordprocessingShape" mc:Ignorable="w14 w15 w16se w16cid w16 w16cex w16sdtdh w16sdtfl w16du wp14">
-  <w16cid:commentId w16cid:paraId="6ACF8584" w16cid:durableId="4DCB12D2"/>
-</w16cid:commentsIds>
 </file>
 
 <file path=word/endnotes.xml><?xml version="1.0" encoding="utf-8"?>
@@ -4676,14 +4604,6 @@
     <w:abstractNumId w:val="0"/>
   </w:num>
 </w:numbering>
-</file>
-
-<file path=word/people.xml><?xml version="1.0" encoding="utf-8"?>
-<w15:people xmlns:wpc="http://schemas.microsoft.com/office/word/2010/wordprocessingCanvas" xmlns:cx="http://schemas.microsoft.com/office/drawing/2014/chartex" xmlns:cx1="http://schemas.microsoft.com/office/drawing/2015/9/8/chartex" xmlns:cx2="http://schemas.microsoft.com/office/drawing/2015/10/21/chartex" xmlns:cx3="http://schemas.microsoft.com/office/drawing/2016/5/9/chartex" xmlns:cx4="http://schemas.microsoft.com/office/drawing/2016/5/10/chartex" xmlns:cx5="http://schemas.microsoft.com/office/drawing/2016/5/11/chartex" xmlns:cx6="http://schemas.microsoft.com/office/drawing/2016/5/12/chartex" xmlns:cx7="http://schemas.microsoft.com/office/drawing/2016/5/13/chartex" xmlns:cx8="http://schemas.microsoft.com/office/drawing/2016/5/14/chartex" xmlns:mc="http://schemas.openxmlformats.org/markup-compatibility/2006" xmlns:aink="http://schemas.microsoft.com/office/drawing/2016/ink" xmlns:am3d="http://schemas.microsoft.com/office/drawing/2017/model3d" xmlns:o="urn:schemas-microsoft-com:office:office" xmlns:oel="http://schemas.microsoft.com/office/2019/extlst" xmlns:r="http://schemas.openxmlformats.org/officeDocument/2006/relationships" xmlns:m="http://schemas.openxmlformats.org/officeDocument/2006/math" xmlns:v="urn:schemas-microsoft-com:vml" xmlns:wp14="http://schemas.microsoft.com/office/word/2010/wordprocessingDrawing" xmlns:wp="http://schemas.openxmlformats.org/drawingml/2006/wordprocessingDrawing" xmlns:w10="urn:schemas-microsoft-com:office:word" xmlns:w="http://schemas.openxmlformats.org/wordprocessingml/2006/main" xmlns:w14="http://schemas.microsoft.com/office/word/2010/wordml" xmlns:w15="http://schemas.microsoft.com/office/word/2012/wordml" xmlns:w16cex="http://schemas.microsoft.com/office/word/2018/wordml/cex" xmlns:w16cid="http://schemas.microsoft.com/office/word/2016/wordml/cid" xmlns:w16="http://schemas.microsoft.com/office/word/2018/wordml" xmlns:w16du="http://schemas.microsoft.com/office/word/2023/wordml/word16du" xmlns:w16sdtdh="http://schemas.microsoft.com/office/word/2020/wordml/sdtdatahash" xmlns:w16sdtfl="http://schemas.microsoft.com/office/word/2024/wordml/sdtformatlock" xmlns:w16se="http://schemas.microsoft.com/office/word/2015/wordml/symex" xmlns:wpg="http://schemas.microsoft.com/office/word/2010/wordprocessingGroup" xmlns:wpi="http://schemas.microsoft.com/office/word/2010/wordprocessingInk" xmlns:wne="http://schemas.microsoft.com/office/word/2006/wordml" xmlns:wps="http://schemas.microsoft.com/office/word/2010/wordprocessingShape" mc:Ignorable="w14 w15 w16se w16cid w16 w16cex w16sdtdh w16sdtfl w16du wp14">
-  <w15:person w15:author="Xu, Jingyi">
-    <w15:presenceInfo w15:providerId="AD" w15:userId="S::jxx240004@utdallas.edu::88e6f708-e560-4dc4-bd16-2d9be0122e4c"/>
-  </w15:person>
-</w15:people>
 </file>
 
 <file path=word/styles.xml><?xml version="1.0" encoding="utf-8"?>

</xml_diff>